<commit_message>
docs: se suben cambios
</commit_message>
<xml_diff>
--- a/informe de requisitos.docx
+++ b/informe de requisitos.docx
@@ -1,6 +1,6 @@
 
 <file path=word/document.xml><?xml version="1.0" encoding="utf-8"?>
-<w:document xmlns:wpc="http://schemas.microsoft.com/office/word/2010/wordprocessingCanvas" xmlns:cx="http://schemas.microsoft.com/office/drawing/2014/chartex" xmlns:mc="http://schemas.openxmlformats.org/markup-compatibility/2006" xmlns:o="urn:schemas-microsoft-com:office:office" xmlns:r="http://schemas.openxmlformats.org/officeDocument/2006/relationships" xmlns:m="http://schemas.openxmlformats.org/officeDocument/2006/math" xmlns:v="urn:schemas-microsoft-com:vml" xmlns:wp14="http://schemas.microsoft.com/office/word/2010/wordprocessingDrawing" xmlns:wp="http://schemas.openxmlformats.org/drawingml/2006/wordprocessingDrawing" xmlns:w10="urn:schemas-microsoft-com:office:word" xmlns:w="http://schemas.openxmlformats.org/wordprocessingml/2006/main" xmlns:w14="http://schemas.microsoft.com/office/word/2010/wordml" xmlns:w15="http://schemas.microsoft.com/office/word/2012/wordml" xmlns:w16se="http://schemas.microsoft.com/office/word/2015/wordml/symex" xmlns:wpg="http://schemas.microsoft.com/office/word/2010/wordprocessingGroup" xmlns:wpi="http://schemas.microsoft.com/office/word/2010/wordprocessingInk" xmlns:wne="http://schemas.microsoft.com/office/word/2006/wordml" xmlns:wps="http://schemas.microsoft.com/office/word/2010/wordprocessingShape" mc:Ignorable="w14 w15 w16se wp14">
+<w:document xmlns:wpc="http://schemas.microsoft.com/office/word/2010/wordprocessingCanvas" xmlns:cx="http://schemas.microsoft.com/office/drawing/2014/chartex" xmlns:cx1="http://schemas.microsoft.com/office/drawing/2015/9/8/chartex" xmlns:cx2="http://schemas.microsoft.com/office/drawing/2015/10/21/chartex" xmlns:cx3="http://schemas.microsoft.com/office/drawing/2016/5/9/chartex" xmlns:cx4="http://schemas.microsoft.com/office/drawing/2016/5/10/chartex" xmlns:cx5="http://schemas.microsoft.com/office/drawing/2016/5/11/chartex" xmlns:cx6="http://schemas.microsoft.com/office/drawing/2016/5/12/chartex" xmlns:cx7="http://schemas.microsoft.com/office/drawing/2016/5/13/chartex" xmlns:cx8="http://schemas.microsoft.com/office/drawing/2016/5/14/chartex" xmlns:mc="http://schemas.openxmlformats.org/markup-compatibility/2006" xmlns:aink="http://schemas.microsoft.com/office/drawing/2016/ink" xmlns:am3d="http://schemas.microsoft.com/office/drawing/2017/model3d" xmlns:o="urn:schemas-microsoft-com:office:office" xmlns:oel="http://schemas.microsoft.com/office/2019/extlst" xmlns:r="http://schemas.openxmlformats.org/officeDocument/2006/relationships" xmlns:m="http://schemas.openxmlformats.org/officeDocument/2006/math" xmlns:v="urn:schemas-microsoft-com:vml" xmlns:wp14="http://schemas.microsoft.com/office/word/2010/wordprocessingDrawing" xmlns:wp="http://schemas.openxmlformats.org/drawingml/2006/wordprocessingDrawing" xmlns:w10="urn:schemas-microsoft-com:office:word" xmlns:w="http://schemas.openxmlformats.org/wordprocessingml/2006/main" xmlns:w14="http://schemas.microsoft.com/office/word/2010/wordml" xmlns:w15="http://schemas.microsoft.com/office/word/2012/wordml" xmlns:w16cex="http://schemas.microsoft.com/office/word/2018/wordml/cex" xmlns:w16cid="http://schemas.microsoft.com/office/word/2016/wordml/cid" xmlns:w16="http://schemas.microsoft.com/office/word/2018/wordml" xmlns:w16du="http://schemas.microsoft.com/office/word/2023/wordml/word16du" xmlns:w16sdtdh="http://schemas.microsoft.com/office/word/2020/wordml/sdtdatahash" xmlns:w16se="http://schemas.microsoft.com/office/word/2015/wordml/symex" xmlns:wpg="http://schemas.microsoft.com/office/word/2010/wordprocessingGroup" xmlns:wpi="http://schemas.microsoft.com/office/word/2010/wordprocessingInk" xmlns:wne="http://schemas.microsoft.com/office/word/2006/wordml" xmlns:wps="http://schemas.microsoft.com/office/word/2010/wordprocessingShape" mc:Ignorable="w14 w15 w16se w16cid w16 w16cex w16sdtdh w16du wp14">
   <w:body>
     <w:p>
       <w:pPr>
@@ -64,16 +64,8 @@
         <w:rPr>
           <w:rFonts w:cs="Times New Roman"/>
         </w:rPr>
-        <w:t xml:space="preserve"> Martínez </w:t>
-      </w:r>
-      <w:proofErr w:type="spellStart"/>
-      <w:r>
-        <w:rPr>
-          <w:rFonts w:cs="Times New Roman"/>
-        </w:rPr>
-        <w:t>Piedrahíta</w:t>
-      </w:r>
-      <w:proofErr w:type="spellEnd"/>
+        <w:t xml:space="preserve"> Martínez Piedrahíta</w:t>
+      </w:r>
       <w:r>
         <w:rPr>
           <w:rFonts w:cs="Times New Roman"/>
@@ -366,7 +358,7 @@
             </w:rPr>
             <w:fldChar w:fldCharType="separate"/>
           </w:r>
-          <w:hyperlink w:anchor="_Toc242124618" w:history="1">
+          <w:hyperlink w:anchor="_Toc242181753" w:history="1">
             <w:r>
               <w:rPr>
                 <w:rStyle w:val="Hipervnculo"/>
@@ -395,7 +387,7 @@
                 <w:noProof/>
                 <w:webHidden/>
               </w:rPr>
-              <w:instrText xml:space="preserve"> PAGEREF _Toc242124618 \h </w:instrText>
+              <w:instrText xml:space="preserve"> PAGEREF _Toc242181753 \h </w:instrText>
             </w:r>
             <w:r>
               <w:rPr>
@@ -441,7 +433,7 @@
               <w:lang w:val="es-MX" w:eastAsia="es-MX"/>
             </w:rPr>
           </w:pPr>
-          <w:hyperlink w:anchor="_Toc242124619" w:history="1">
+          <w:hyperlink w:anchor="_Toc242181754" w:history="1">
             <w:r>
               <w:rPr>
                 <w:rStyle w:val="Hipervnculo"/>
@@ -469,7 +461,7 @@
                 <w:noProof/>
                 <w:webHidden/>
               </w:rPr>
-              <w:instrText xml:space="preserve"> PAGEREF _Toc242124619 \h </w:instrText>
+              <w:instrText xml:space="preserve"> PAGEREF _Toc242181754 \h </w:instrText>
             </w:r>
             <w:r>
               <w:rPr>
@@ -515,7 +507,7 @@
               <w:lang w:val="es-MX" w:eastAsia="es-MX"/>
             </w:rPr>
           </w:pPr>
-          <w:hyperlink w:anchor="_Toc242124620" w:history="1">
+          <w:hyperlink w:anchor="_Toc242181755" w:history="1">
             <w:r>
               <w:rPr>
                 <w:rStyle w:val="Hipervnculo"/>
@@ -543,7 +535,7 @@
                 <w:noProof/>
                 <w:webHidden/>
               </w:rPr>
-              <w:instrText xml:space="preserve"> PAGEREF _Toc242124620 \h </w:instrText>
+              <w:instrText xml:space="preserve"> PAGEREF _Toc242181755 \h </w:instrText>
             </w:r>
             <w:r>
               <w:rPr>
@@ -589,7 +581,7 @@
               <w:lang w:val="es-MX" w:eastAsia="es-MX"/>
             </w:rPr>
           </w:pPr>
-          <w:hyperlink w:anchor="_Toc242124621" w:history="1">
+          <w:hyperlink w:anchor="_Toc242181756" w:history="1">
             <w:r>
               <w:rPr>
                 <w:rStyle w:val="Hipervnculo"/>
@@ -616,7 +608,7 @@
                 <w:noProof/>
                 <w:webHidden/>
               </w:rPr>
-              <w:instrText xml:space="preserve"> PAGEREF _Toc242124621 \h </w:instrText>
+              <w:instrText xml:space="preserve"> PAGEREF _Toc242181756 \h </w:instrText>
             </w:r>
             <w:r>
               <w:rPr>
@@ -662,7 +654,7 @@
               <w:lang w:val="es-MX" w:eastAsia="es-MX"/>
             </w:rPr>
           </w:pPr>
-          <w:hyperlink w:anchor="_Toc242124622" w:history="1">
+          <w:hyperlink w:anchor="_Toc242181757" w:history="1">
             <w:r>
               <w:rPr>
                 <w:rStyle w:val="Hipervnculo"/>
@@ -689,7 +681,7 @@
                 <w:noProof/>
                 <w:webHidden/>
               </w:rPr>
-              <w:instrText xml:space="preserve"> PAGEREF _Toc242124622 \h </w:instrText>
+              <w:instrText xml:space="preserve"> PAGEREF _Toc242181757 \h </w:instrText>
             </w:r>
             <w:r>
               <w:rPr>
@@ -735,7 +727,7 @@
               <w:lang w:val="es-MX" w:eastAsia="es-MX"/>
             </w:rPr>
           </w:pPr>
-          <w:hyperlink w:anchor="_Toc242124623" w:history="1">
+          <w:hyperlink w:anchor="_Toc242181758" w:history="1">
             <w:r>
               <w:rPr>
                 <w:rStyle w:val="Hipervnculo"/>
@@ -762,7 +754,7 @@
                 <w:noProof/>
                 <w:webHidden/>
               </w:rPr>
-              <w:instrText xml:space="preserve"> PAGEREF _Toc242124623 \h </w:instrText>
+              <w:instrText xml:space="preserve"> PAGEREF _Toc242181758 \h </w:instrText>
             </w:r>
             <w:r>
               <w:rPr>
@@ -808,7 +800,7 @@
               <w:lang w:val="es-MX" w:eastAsia="es-MX"/>
             </w:rPr>
           </w:pPr>
-          <w:hyperlink w:anchor="_Toc242124624" w:history="1">
+          <w:hyperlink w:anchor="_Toc242181759" w:history="1">
             <w:r>
               <w:rPr>
                 <w:rStyle w:val="Hipervnculo"/>
@@ -836,7 +828,7 @@
                 <w:noProof/>
                 <w:webHidden/>
               </w:rPr>
-              <w:instrText xml:space="preserve"> PAGEREF _Toc242124624 \h </w:instrText>
+              <w:instrText xml:space="preserve"> PAGEREF _Toc242181759 \h </w:instrText>
             </w:r>
             <w:r>
               <w:rPr>
@@ -882,7 +874,7 @@
               <w:lang w:val="es-MX" w:eastAsia="es-MX"/>
             </w:rPr>
           </w:pPr>
-          <w:hyperlink w:anchor="_Toc242124625" w:history="1">
+          <w:hyperlink w:anchor="_Toc242181760" w:history="1">
             <w:r>
               <w:rPr>
                 <w:rStyle w:val="Hipervnculo"/>
@@ -909,7 +901,7 @@
                 <w:noProof/>
                 <w:webHidden/>
               </w:rPr>
-              <w:instrText xml:space="preserve"> PAGEREF _Toc242124625 \h </w:instrText>
+              <w:instrText xml:space="preserve"> PAGEREF _Toc242181760 \h </w:instrText>
             </w:r>
             <w:r>
               <w:rPr>
@@ -955,7 +947,7 @@
               <w:lang w:val="es-MX" w:eastAsia="es-MX"/>
             </w:rPr>
           </w:pPr>
-          <w:hyperlink w:anchor="_Toc242124626" w:history="1">
+          <w:hyperlink w:anchor="_Toc242181761" w:history="1">
             <w:r>
               <w:rPr>
                 <w:rStyle w:val="Hipervnculo"/>
@@ -984,7 +976,7 @@
                 <w:noProof/>
                 <w:webHidden/>
               </w:rPr>
-              <w:instrText xml:space="preserve"> PAGEREF _Toc242124626 \h </w:instrText>
+              <w:instrText xml:space="preserve"> PAGEREF _Toc242181761 \h </w:instrText>
             </w:r>
             <w:r>
               <w:rPr>
@@ -1030,7 +1022,7 @@
               <w:lang w:val="es-MX" w:eastAsia="es-MX"/>
             </w:rPr>
           </w:pPr>
-          <w:hyperlink w:anchor="_Toc242124627" w:history="1">
+          <w:hyperlink w:anchor="_Toc242181762" w:history="1">
             <w:r>
               <w:rPr>
                 <w:rStyle w:val="Hipervnculo"/>
@@ -1059,7 +1051,7 @@
                 <w:noProof/>
                 <w:webHidden/>
               </w:rPr>
-              <w:instrText xml:space="preserve"> PAGEREF _Toc242124627 \h </w:instrText>
+              <w:instrText xml:space="preserve"> PAGEREF _Toc242181762 \h </w:instrText>
             </w:r>
             <w:r>
               <w:rPr>
@@ -1080,6 +1072,79 @@
                 <w:webHidden/>
               </w:rPr>
               <w:t>9</w:t>
+            </w:r>
+            <w:r>
+              <w:rPr>
+                <w:noProof/>
+                <w:webHidden/>
+              </w:rPr>
+              <w:fldChar w:fldCharType="end"/>
+            </w:r>
+          </w:hyperlink>
+        </w:p>
+        <w:p>
+          <w:pPr>
+            <w:pStyle w:val="TDC2"/>
+            <w:tabs>
+              <w:tab w:val="right" w:leader="dot" w:pos="8828"/>
+            </w:tabs>
+            <w:rPr>
+              <w:rFonts w:asciiTheme="minorHAnsi" w:eastAsiaTheme="minorEastAsia" w:hAnsiTheme="minorHAnsi"/>
+              <w:noProof/>
+              <w:color w:val="auto"/>
+              <w:sz w:val="22"/>
+              <w:szCs w:val="22"/>
+              <w:lang w:val="es-MX" w:eastAsia="es-MX"/>
+            </w:rPr>
+          </w:pPr>
+          <w:hyperlink w:anchor="_Toc242181763" w:history="1">
+            <w:r>
+              <w:rPr>
+                <w:rStyle w:val="Hipervnculo"/>
+                <w:noProof/>
+              </w:rPr>
+              <w:t>Tabla 1</w:t>
+            </w:r>
+            <w:r>
+              <w:rPr>
+                <w:noProof/>
+                <w:webHidden/>
+              </w:rPr>
+              <w:tab/>
+            </w:r>
+            <w:r>
+              <w:rPr>
+                <w:noProof/>
+                <w:webHidden/>
+              </w:rPr>
+              <w:fldChar w:fldCharType="begin"/>
+            </w:r>
+            <w:r>
+              <w:rPr>
+                <w:noProof/>
+                <w:webHidden/>
+              </w:rPr>
+              <w:instrText xml:space="preserve"> PAGEREF _Toc242181763 \h </w:instrText>
+            </w:r>
+            <w:r>
+              <w:rPr>
+                <w:noProof/>
+                <w:webHidden/>
+              </w:rPr>
+            </w:r>
+            <w:r>
+              <w:rPr>
+                <w:noProof/>
+                <w:webHidden/>
+              </w:rPr>
+              <w:fldChar w:fldCharType="separate"/>
+            </w:r>
+            <w:r>
+              <w:rPr>
+                <w:noProof/>
+                <w:webHidden/>
+              </w:rPr>
+              <w:t>10</w:t>
             </w:r>
             <w:r>
               <w:rPr>
@@ -1105,7 +1170,7 @@
               <w:lang w:val="es-MX" w:eastAsia="es-MX"/>
             </w:rPr>
           </w:pPr>
-          <w:hyperlink w:anchor="_Toc242124628" w:history="1">
+          <w:hyperlink w:anchor="_Toc242181764" w:history="1">
             <w:r>
               <w:rPr>
                 <w:rStyle w:val="Hipervnculo"/>
@@ -1133,7 +1198,7 @@
                 <w:noProof/>
                 <w:webHidden/>
               </w:rPr>
-              <w:instrText xml:space="preserve"> PAGEREF _Toc242124628 \h </w:instrText>
+              <w:instrText xml:space="preserve"> PAGEREF _Toc242181764 \h </w:instrText>
             </w:r>
             <w:r>
               <w:rPr>
@@ -1153,7 +1218,7 @@
                 <w:noProof/>
                 <w:webHidden/>
               </w:rPr>
-              <w:t>11</w:t>
+              <w:t>12</w:t>
             </w:r>
             <w:r>
               <w:rPr>
@@ -1179,7 +1244,7 @@
               <w:lang w:val="es-MX" w:eastAsia="es-MX"/>
             </w:rPr>
           </w:pPr>
-          <w:hyperlink w:anchor="_Toc242124629" w:history="1">
+          <w:hyperlink w:anchor="_Toc242181765" w:history="1">
             <w:r>
               <w:rPr>
                 <w:rStyle w:val="Hipervnculo"/>
@@ -1207,7 +1272,7 @@
                 <w:noProof/>
                 <w:webHidden/>
               </w:rPr>
-              <w:instrText xml:space="preserve"> PAGEREF _Toc242124629 \h </w:instrText>
+              <w:instrText xml:space="preserve"> PAGEREF _Toc242181765 \h </w:instrText>
             </w:r>
             <w:r>
               <w:rPr>
@@ -1253,7 +1318,7 @@
               <w:lang w:val="es-MX" w:eastAsia="es-MX"/>
             </w:rPr>
           </w:pPr>
-          <w:hyperlink w:anchor="_Toc242124630" w:history="1">
+          <w:hyperlink w:anchor="_Toc242181766" w:history="1">
             <w:r>
               <w:rPr>
                 <w:rStyle w:val="Hipervnculo"/>
@@ -1281,7 +1346,7 @@
                 <w:noProof/>
                 <w:webHidden/>
               </w:rPr>
-              <w:instrText xml:space="preserve"> PAGEREF _Toc242124630 \h </w:instrText>
+              <w:instrText xml:space="preserve"> PAGEREF _Toc242181766 \h </w:instrText>
             </w:r>
             <w:r>
               <w:rPr>
@@ -1327,7 +1392,7 @@
               <w:lang w:val="es-MX" w:eastAsia="es-MX"/>
             </w:rPr>
           </w:pPr>
-          <w:hyperlink w:anchor="_Toc242124631" w:history="1">
+          <w:hyperlink w:anchor="_Toc242181767" w:history="1">
             <w:r>
               <w:rPr>
                 <w:rStyle w:val="Hipervnculo"/>
@@ -1355,7 +1420,7 @@
                 <w:noProof/>
                 <w:webHidden/>
               </w:rPr>
-              <w:instrText xml:space="preserve"> PAGEREF _Toc242124631 \h </w:instrText>
+              <w:instrText xml:space="preserve"> PAGEREF _Toc242181767 \h </w:instrText>
             </w:r>
             <w:r>
               <w:rPr>
@@ -1376,6 +1441,299 @@
                 <w:webHidden/>
               </w:rPr>
               <w:t>13</w:t>
+            </w:r>
+            <w:r>
+              <w:rPr>
+                <w:noProof/>
+                <w:webHidden/>
+              </w:rPr>
+              <w:fldChar w:fldCharType="end"/>
+            </w:r>
+          </w:hyperlink>
+        </w:p>
+        <w:p>
+          <w:pPr>
+            <w:pStyle w:val="TDC1"/>
+            <w:tabs>
+              <w:tab w:val="right" w:leader="dot" w:pos="8828"/>
+            </w:tabs>
+            <w:rPr>
+              <w:rFonts w:asciiTheme="minorHAnsi" w:eastAsiaTheme="minorEastAsia" w:hAnsiTheme="minorHAnsi"/>
+              <w:noProof/>
+              <w:color w:val="auto"/>
+              <w:sz w:val="22"/>
+              <w:szCs w:val="22"/>
+              <w:lang w:val="es-MX" w:eastAsia="es-MX"/>
+            </w:rPr>
+          </w:pPr>
+          <w:hyperlink w:anchor="_Toc242181768" w:history="1">
+            <w:r>
+              <w:rPr>
+                <w:rStyle w:val="Hipervnculo"/>
+                <w:noProof/>
+              </w:rPr>
+              <w:t>Glosario</w:t>
+            </w:r>
+            <w:r>
+              <w:rPr>
+                <w:noProof/>
+                <w:webHidden/>
+              </w:rPr>
+              <w:tab/>
+            </w:r>
+            <w:r>
+              <w:rPr>
+                <w:noProof/>
+                <w:webHidden/>
+              </w:rPr>
+              <w:fldChar w:fldCharType="begin"/>
+            </w:r>
+            <w:r>
+              <w:rPr>
+                <w:noProof/>
+                <w:webHidden/>
+              </w:rPr>
+              <w:instrText xml:space="preserve"> PAGEREF _Toc242181768 \h </w:instrText>
+            </w:r>
+            <w:r>
+              <w:rPr>
+                <w:noProof/>
+                <w:webHidden/>
+              </w:rPr>
+            </w:r>
+            <w:r>
+              <w:rPr>
+                <w:noProof/>
+                <w:webHidden/>
+              </w:rPr>
+              <w:fldChar w:fldCharType="separate"/>
+            </w:r>
+            <w:r>
+              <w:rPr>
+                <w:noProof/>
+                <w:webHidden/>
+              </w:rPr>
+              <w:t>15</w:t>
+            </w:r>
+            <w:r>
+              <w:rPr>
+                <w:noProof/>
+                <w:webHidden/>
+              </w:rPr>
+              <w:fldChar w:fldCharType="end"/>
+            </w:r>
+          </w:hyperlink>
+        </w:p>
+        <w:p>
+          <w:pPr>
+            <w:pStyle w:val="TDC2"/>
+            <w:tabs>
+              <w:tab w:val="right" w:leader="dot" w:pos="8828"/>
+            </w:tabs>
+            <w:rPr>
+              <w:rFonts w:asciiTheme="minorHAnsi" w:eastAsiaTheme="minorEastAsia" w:hAnsiTheme="minorHAnsi"/>
+              <w:noProof/>
+              <w:color w:val="auto"/>
+              <w:sz w:val="22"/>
+              <w:szCs w:val="22"/>
+              <w:lang w:val="es-MX" w:eastAsia="es-MX"/>
+            </w:rPr>
+          </w:pPr>
+          <w:hyperlink w:anchor="_Toc242181769" w:history="1">
+            <w:r>
+              <w:rPr>
+                <w:rStyle w:val="Hipervnculo"/>
+                <w:noProof/>
+              </w:rPr>
+              <w:t>Términos No Técnicos</w:t>
+            </w:r>
+            <w:r>
+              <w:rPr>
+                <w:noProof/>
+                <w:webHidden/>
+              </w:rPr>
+              <w:tab/>
+            </w:r>
+            <w:r>
+              <w:rPr>
+                <w:noProof/>
+                <w:webHidden/>
+              </w:rPr>
+              <w:fldChar w:fldCharType="begin"/>
+            </w:r>
+            <w:r>
+              <w:rPr>
+                <w:noProof/>
+                <w:webHidden/>
+              </w:rPr>
+              <w:instrText xml:space="preserve"> PAGEREF _Toc242181769 \h </w:instrText>
+            </w:r>
+            <w:r>
+              <w:rPr>
+                <w:noProof/>
+                <w:webHidden/>
+              </w:rPr>
+            </w:r>
+            <w:r>
+              <w:rPr>
+                <w:noProof/>
+                <w:webHidden/>
+              </w:rPr>
+              <w:fldChar w:fldCharType="separate"/>
+            </w:r>
+            <w:r>
+              <w:rPr>
+                <w:noProof/>
+                <w:webHidden/>
+              </w:rPr>
+              <w:t>16</w:t>
+            </w:r>
+            <w:r>
+              <w:rPr>
+                <w:noProof/>
+                <w:webHidden/>
+              </w:rPr>
+              <w:fldChar w:fldCharType="end"/>
+            </w:r>
+          </w:hyperlink>
+        </w:p>
+        <w:p>
+          <w:pPr>
+            <w:pStyle w:val="TDC1"/>
+            <w:tabs>
+              <w:tab w:val="right" w:leader="dot" w:pos="8828"/>
+            </w:tabs>
+            <w:rPr>
+              <w:rFonts w:asciiTheme="minorHAnsi" w:eastAsiaTheme="minorEastAsia" w:hAnsiTheme="minorHAnsi"/>
+              <w:noProof/>
+              <w:color w:val="auto"/>
+              <w:sz w:val="22"/>
+              <w:szCs w:val="22"/>
+              <w:lang w:val="es-MX" w:eastAsia="es-MX"/>
+            </w:rPr>
+          </w:pPr>
+          <w:hyperlink w:anchor="_Toc242181770" w:history="1">
+            <w:r>
+              <w:rPr>
+                <w:rStyle w:val="Hipervnculo"/>
+                <w:noProof/>
+                <w:lang w:val="en-US"/>
+              </w:rPr>
+              <w:t>Referencias</w:t>
+            </w:r>
+            <w:r>
+              <w:rPr>
+                <w:noProof/>
+                <w:webHidden/>
+              </w:rPr>
+              <w:tab/>
+            </w:r>
+            <w:r>
+              <w:rPr>
+                <w:noProof/>
+                <w:webHidden/>
+              </w:rPr>
+              <w:fldChar w:fldCharType="begin"/>
+            </w:r>
+            <w:r>
+              <w:rPr>
+                <w:noProof/>
+                <w:webHidden/>
+              </w:rPr>
+              <w:instrText xml:space="preserve"> PAGEREF _Toc242181770 \h </w:instrText>
+            </w:r>
+            <w:r>
+              <w:rPr>
+                <w:noProof/>
+                <w:webHidden/>
+              </w:rPr>
+            </w:r>
+            <w:r>
+              <w:rPr>
+                <w:noProof/>
+                <w:webHidden/>
+              </w:rPr>
+              <w:fldChar w:fldCharType="separate"/>
+            </w:r>
+            <w:r>
+              <w:rPr>
+                <w:noProof/>
+                <w:webHidden/>
+              </w:rPr>
+              <w:t>18</w:t>
+            </w:r>
+            <w:r>
+              <w:rPr>
+                <w:noProof/>
+                <w:webHidden/>
+              </w:rPr>
+              <w:fldChar w:fldCharType="end"/>
+            </w:r>
+          </w:hyperlink>
+        </w:p>
+        <w:p>
+          <w:pPr>
+            <w:pStyle w:val="TDC1"/>
+            <w:tabs>
+              <w:tab w:val="right" w:leader="dot" w:pos="8828"/>
+            </w:tabs>
+            <w:rPr>
+              <w:rFonts w:asciiTheme="minorHAnsi" w:eastAsiaTheme="minorEastAsia" w:hAnsiTheme="minorHAnsi"/>
+              <w:noProof/>
+              <w:color w:val="auto"/>
+              <w:sz w:val="22"/>
+              <w:szCs w:val="22"/>
+              <w:lang w:val="es-MX" w:eastAsia="es-MX"/>
+            </w:rPr>
+          </w:pPr>
+          <w:hyperlink w:anchor="_Toc242181771" w:history="1">
+            <w:r>
+              <w:rPr>
+                <w:rStyle w:val="Hipervnculo"/>
+                <w:noProof/>
+              </w:rPr>
+              <w:t>Reglamentación y Condiciones Legales</w:t>
+            </w:r>
+            <w:r>
+              <w:rPr>
+                <w:noProof/>
+                <w:webHidden/>
+              </w:rPr>
+              <w:tab/>
+            </w:r>
+            <w:r>
+              <w:rPr>
+                <w:noProof/>
+                <w:webHidden/>
+              </w:rPr>
+              <w:fldChar w:fldCharType="begin"/>
+            </w:r>
+            <w:r>
+              <w:rPr>
+                <w:noProof/>
+                <w:webHidden/>
+              </w:rPr>
+              <w:instrText xml:space="preserve"> PAGEREF _Toc242181771 \h </w:instrText>
+            </w:r>
+            <w:r>
+              <w:rPr>
+                <w:noProof/>
+                <w:webHidden/>
+              </w:rPr>
+            </w:r>
+            <w:r>
+              <w:rPr>
+                <w:noProof/>
+                <w:webHidden/>
+              </w:rPr>
+              <w:fldChar w:fldCharType="separate"/>
+            </w:r>
+            <w:r>
+              <w:rPr>
+                <w:noProof/>
+                <w:webHidden/>
+              </w:rPr>
+              <w:t>20</w:t>
             </w:r>
             <w:r>
               <w:rPr>
@@ -1461,7 +1819,7 @@
           <w:lang w:val="en-US"/>
         </w:rPr>
       </w:pPr>
-      <w:bookmarkStart w:id="0" w:name="_Toc242124618"/>
+      <w:bookmarkStart w:id="0" w:name="_Toc242181753"/>
       <w:proofErr w:type="spellStart"/>
       <w:r>
         <w:rPr>
@@ -1634,202 +1992,6 @@
     </w:p>
     <w:p>
       <w:pPr>
-        <w:jc w:val="both"/>
-        <w:rPr>
-          <w:rFonts w:cs="Times New Roman"/>
-        </w:rPr>
-      </w:pPr>
-      <w:r>
-        <w:rPr>
-          <w:rFonts w:cs="Times New Roman"/>
-          <w:b/>
-          <w:bCs/>
-        </w:rPr>
-        <w:t>Tabla 1</w:t>
-      </w:r>
-      <w:r>
-        <w:rPr>
-          <w:rFonts w:cs="Times New Roman"/>
-        </w:rPr>
-        <w:t>.</w:t>
-      </w:r>
-    </w:p>
-    <w:p>
-      <w:pPr>
-        <w:ind w:left="708" w:firstLine="12"/>
-        <w:jc w:val="both"/>
-        <w:rPr>
-          <w:rFonts w:cs="Times New Roman"/>
-        </w:rPr>
-      </w:pPr>
-      <w:r>
-        <w:rPr>
-          <w:rFonts w:cs="Times New Roman"/>
-        </w:rPr>
-        <w:t xml:space="preserve">Colecciones Descripción: Permite almacenar las colecciones creadas por los </w:t>
-      </w:r>
-      <w:r>
-        <w:rPr>
-          <w:rFonts w:cs="Times New Roman"/>
-        </w:rPr>
-        <w:t>u</w:t>
-      </w:r>
-      <w:r>
-        <w:rPr>
-          <w:rFonts w:cs="Times New Roman"/>
-        </w:rPr>
-        <w:t xml:space="preserve">suarios. </w:t>
-      </w:r>
-    </w:p>
-    <w:p>
-      <w:pPr>
-        <w:jc w:val="both"/>
-        <w:rPr>
-          <w:rFonts w:cs="Times New Roman"/>
-          <w:b/>
-          <w:bCs/>
-        </w:rPr>
-      </w:pPr>
-      <w:r>
-        <w:rPr>
-          <w:rFonts w:cs="Times New Roman"/>
-          <w:b/>
-          <w:bCs/>
-        </w:rPr>
-        <w:t xml:space="preserve">Tabla 2. </w:t>
-      </w:r>
-    </w:p>
-    <w:p>
-      <w:pPr>
-        <w:jc w:val="both"/>
-        <w:rPr>
-          <w:rFonts w:cs="Times New Roman"/>
-        </w:rPr>
-      </w:pPr>
-      <w:r>
-        <w:rPr>
-          <w:rFonts w:cs="Times New Roman"/>
-        </w:rPr>
-        <w:t xml:space="preserve">Favoritos Descripción: Registra las recetas guardadas por cada usuario. </w:t>
-      </w:r>
-    </w:p>
-    <w:p>
-      <w:pPr>
-        <w:jc w:val="both"/>
-        <w:rPr>
-          <w:rFonts w:cs="Times New Roman"/>
-          <w:b/>
-          <w:bCs/>
-        </w:rPr>
-      </w:pPr>
-      <w:r>
-        <w:rPr>
-          <w:rFonts w:cs="Times New Roman"/>
-          <w:b/>
-          <w:bCs/>
-        </w:rPr>
-        <w:t>Tabla 3.</w:t>
-      </w:r>
-    </w:p>
-    <w:p>
-      <w:pPr>
-        <w:jc w:val="both"/>
-        <w:rPr>
-          <w:rFonts w:cs="Times New Roman"/>
-        </w:rPr>
-      </w:pPr>
-      <w:r>
-        <w:rPr>
-          <w:rFonts w:cs="Times New Roman"/>
-        </w:rPr>
-        <w:t xml:space="preserve">Comentarios Descripción: Almacena comentarios realizados sobre las recetas. </w:t>
-      </w:r>
-    </w:p>
-    <w:p>
-      <w:pPr>
-        <w:jc w:val="both"/>
-        <w:rPr>
-          <w:rFonts w:cs="Times New Roman"/>
-          <w:b/>
-          <w:bCs/>
-        </w:rPr>
-      </w:pPr>
-      <w:r>
-        <w:rPr>
-          <w:rFonts w:cs="Times New Roman"/>
-          <w:b/>
-          <w:bCs/>
-        </w:rPr>
-        <w:t>Tabla 4.</w:t>
-      </w:r>
-    </w:p>
-    <w:p>
-      <w:pPr>
-        <w:jc w:val="both"/>
-        <w:rPr>
-          <w:rFonts w:cs="Times New Roman"/>
-        </w:rPr>
-      </w:pPr>
-      <w:r>
-        <w:rPr>
-          <w:rFonts w:cs="Times New Roman"/>
-        </w:rPr>
-        <w:t xml:space="preserve">Reportes Descripción: Registra reportes de contenido realizados por los usuarios. </w:t>
-      </w:r>
-    </w:p>
-    <w:p>
-      <w:pPr>
-        <w:jc w:val="both"/>
-        <w:rPr>
-          <w:rFonts w:cs="Times New Roman"/>
-          <w:b/>
-          <w:bCs/>
-        </w:rPr>
-      </w:pPr>
-      <w:r>
-        <w:rPr>
-          <w:rFonts w:cs="Times New Roman"/>
-          <w:b/>
-          <w:bCs/>
-        </w:rPr>
-        <w:t>Tabla 5.</w:t>
-      </w:r>
-    </w:p>
-    <w:p>
-      <w:pPr>
-        <w:jc w:val="both"/>
-        <w:rPr>
-          <w:rFonts w:cs="Times New Roman"/>
-        </w:rPr>
-      </w:pPr>
-      <w:r>
-        <w:rPr>
-          <w:rFonts w:cs="Times New Roman"/>
-        </w:rPr>
-        <w:t xml:space="preserve">Calificaciones Descripción: Guarda las puntuaciones asignadas a las recetas. </w:t>
-      </w:r>
-    </w:p>
-    <w:p>
-      <w:pPr>
-        <w:jc w:val="both"/>
-        <w:rPr>
-          <w:rFonts w:cs="Times New Roman"/>
-          <w:b/>
-          <w:bCs/>
-        </w:rPr>
-      </w:pPr>
-      <w:r>
-        <w:rPr>
-          <w:rFonts w:cs="Times New Roman"/>
-          <w:b/>
-          <w:bCs/>
-        </w:rPr>
-        <w:t>Tabla 6.</w:t>
-      </w:r>
-    </w:p>
-    <w:p>
-      <w:pPr>
-        <w:jc w:val="both"/>
         <w:rPr>
           <w:rFonts w:cs="Times New Roman"/>
           <w:lang w:val="es-MX"/>
@@ -1838,22 +2000,8 @@
       <w:r>
         <w:rPr>
           <w:rFonts w:cs="Times New Roman"/>
-        </w:rPr>
-        <w:t>Favoritos colecciones Descripción: Relaciona recetas favoritas con colecciones.</w:t>
-      </w:r>
-    </w:p>
-    <w:p>
-      <w:pPr>
-        <w:rPr>
-          <w:rFonts w:cs="Times New Roman"/>
           <w:lang w:val="es-MX"/>
         </w:rPr>
-      </w:pPr>
-      <w:r>
-        <w:rPr>
-          <w:rFonts w:cs="Times New Roman"/>
-          <w:lang w:val="es-MX"/>
-        </w:rPr>
         <w:br w:type="page"/>
       </w:r>
     </w:p>
@@ -1865,7 +2013,7 @@
           <w:szCs w:val="24"/>
         </w:rPr>
       </w:pPr>
-      <w:bookmarkStart w:id="1" w:name="_Toc242124619"/>
+      <w:bookmarkStart w:id="1" w:name="_Toc242181754"/>
       <w:r>
         <w:rPr>
           <w:rFonts w:cs="Times New Roman"/>
@@ -2027,7 +2175,7 @@
           <w:szCs w:val="24"/>
         </w:rPr>
       </w:pPr>
-      <w:bookmarkStart w:id="2" w:name="_Toc242124620"/>
+      <w:bookmarkStart w:id="2" w:name="_Toc242181755"/>
       <w:r>
         <w:rPr>
           <w:rFonts w:cs="Times New Roman"/>
@@ -2106,7 +2254,7 @@
         <w:lastRenderedPageBreak/>
         <w:t xml:space="preserve"> </w:t>
       </w:r>
-      <w:bookmarkStart w:id="3" w:name="_Toc242124621"/>
+      <w:bookmarkStart w:id="3" w:name="_Toc242181756"/>
       <w:r>
         <w:t>Objetivos</w:t>
       </w:r>
@@ -2119,7 +2267,7 @@
       <w:r>
         <w:t xml:space="preserve"> </w:t>
       </w:r>
-      <w:bookmarkStart w:id="4" w:name="_Toc242124622"/>
+      <w:bookmarkStart w:id="4" w:name="_Toc242181757"/>
       <w:r>
         <w:t>Objetivo general</w:t>
       </w:r>
@@ -2137,7 +2285,7 @@
       <w:r>
         <w:t xml:space="preserve"> </w:t>
       </w:r>
-      <w:bookmarkStart w:id="5" w:name="_Toc242124623"/>
+      <w:bookmarkStart w:id="5" w:name="_Toc242181758"/>
       <w:r>
         <w:t>Objetivos específicos</w:t>
       </w:r>
@@ -2277,7 +2425,7 @@
           <w:szCs w:val="24"/>
         </w:rPr>
       </w:pPr>
-      <w:bookmarkStart w:id="6" w:name="_Toc242124624"/>
+      <w:bookmarkStart w:id="6" w:name="_Toc242181759"/>
       <w:r>
         <w:rPr>
           <w:rFonts w:cs="Times New Roman"/>
@@ -2315,7 +2463,7 @@
       <w:r>
         <w:t xml:space="preserve"> </w:t>
       </w:r>
-      <w:bookmarkStart w:id="7" w:name="_Toc242124625"/>
+      <w:bookmarkStart w:id="7" w:name="_Toc242181760"/>
       <w:r>
         <w:t>Necesidad</w:t>
       </w:r>
@@ -2349,7 +2497,7 @@
         </w:rPr>
         <w:t xml:space="preserve"> </w:t>
       </w:r>
-      <w:bookmarkStart w:id="8" w:name="_Toc242124626"/>
+      <w:bookmarkStart w:id="8" w:name="_Toc242181761"/>
       <w:r>
         <w:rPr>
           <w:rFonts w:eastAsia="Times New Roman"/>
@@ -2394,7 +2542,7 @@
           <w:lang w:val="es-MX" w:eastAsia="es-MX"/>
         </w:rPr>
       </w:pPr>
-      <w:bookmarkStart w:id="9" w:name="_Toc242124627"/>
+      <w:bookmarkStart w:id="9" w:name="_Toc242181762"/>
       <w:r>
         <w:rPr>
           <w:rFonts w:eastAsia="Times New Roman"/>
@@ -2427,91 +2575,72 @@
     <w:p>
       <w:pPr>
         <w:rPr>
+          <w:lang w:val="es-MX" w:eastAsia="es-MX"/>
+        </w:rPr>
+      </w:pPr>
+    </w:p>
+    <w:p>
+      <w:pPr>
+        <w:rPr>
           <w:rFonts w:cs="Times New Roman"/>
           <w:lang w:val="es-MX"/>
         </w:rPr>
       </w:pPr>
+    </w:p>
+    <w:p>
+      <w:pPr>
+        <w:pStyle w:val="Ttulo2"/>
+      </w:pPr>
+      <w:bookmarkStart w:id="10" w:name="_Toc241140091"/>
+      <w:bookmarkStart w:id="11" w:name="_Toc242181763"/>
+      <w:r>
+        <w:t xml:space="preserve">Tabla </w:t>
+      </w:r>
+      <w:fldSimple w:instr=" SEQ Tabla \* ARABIC ">
+        <w:r>
+          <w:rPr>
+            <w:noProof/>
+          </w:rPr>
+          <w:t>1</w:t>
+        </w:r>
+        <w:bookmarkEnd w:id="11"/>
+      </w:fldSimple>
+      <w:r>
+        <w:t xml:space="preserve"> </w:t>
+      </w:r>
     </w:p>
     <w:p>
       <w:pPr>
         <w:pStyle w:val="Descripcin"/>
         <w:keepNext/>
+        <w:ind w:firstLine="0"/>
         <w:rPr>
           <w:rFonts w:cs="Times New Roman"/>
           <w:sz w:val="24"/>
           <w:szCs w:val="24"/>
         </w:rPr>
       </w:pPr>
-      <w:bookmarkStart w:id="10" w:name="_Toc241140091"/>
       <w:r>
         <w:rPr>
           <w:rFonts w:cs="Times New Roman"/>
           <w:sz w:val="24"/>
           <w:szCs w:val="24"/>
         </w:rPr>
-        <w:t xml:space="preserve">Tabla </w:t>
-      </w:r>
-      <w:r>
-        <w:rPr>
-          <w:rFonts w:cs="Times New Roman"/>
-          <w:sz w:val="24"/>
-          <w:szCs w:val="24"/>
-        </w:rPr>
-        <w:fldChar w:fldCharType="begin"/>
-      </w:r>
-      <w:r>
-        <w:rPr>
-          <w:rFonts w:cs="Times New Roman"/>
-          <w:sz w:val="24"/>
-          <w:szCs w:val="24"/>
-        </w:rPr>
-        <w:instrText xml:space="preserve"> SEQ Tabla \* ARABIC </w:instrText>
-      </w:r>
-      <w:r>
-        <w:rPr>
-          <w:rFonts w:cs="Times New Roman"/>
-          <w:sz w:val="24"/>
-          <w:szCs w:val="24"/>
-        </w:rPr>
-        <w:fldChar w:fldCharType="separate"/>
-      </w:r>
-      <w:r>
-        <w:rPr>
-          <w:rFonts w:cs="Times New Roman"/>
-          <w:noProof/>
-          <w:sz w:val="24"/>
-          <w:szCs w:val="24"/>
-        </w:rPr>
-        <w:t>1</w:t>
-      </w:r>
-      <w:r>
-        <w:rPr>
-          <w:rFonts w:cs="Times New Roman"/>
-          <w:sz w:val="24"/>
-          <w:szCs w:val="24"/>
-        </w:rPr>
-        <w:fldChar w:fldCharType="end"/>
-      </w:r>
-      <w:r>
-        <w:rPr>
-          <w:rFonts w:cs="Times New Roman"/>
-          <w:sz w:val="24"/>
-          <w:szCs w:val="24"/>
-        </w:rPr>
-        <w:t xml:space="preserve"> - Comparativa</w:t>
+        <w:t>- Comparativa</w:t>
       </w:r>
       <w:bookmarkEnd w:id="10"/>
     </w:p>
     <w:tbl>
       <w:tblPr>
-        <w:tblStyle w:val="Tablanormal2"/>
+        <w:tblStyle w:val="APA"/>
         <w:tblW w:w="0" w:type="auto"/>
         <w:tblLook w:val="04A0" w:firstRow="1" w:lastRow="0" w:firstColumn="1" w:lastColumn="0" w:noHBand="0" w:noVBand="1"/>
       </w:tblPr>
       <w:tblGrid>
-        <w:gridCol w:w="2942"/>
-        <w:gridCol w:w="2943"/>
-        <w:gridCol w:w="2943"/>
+        <w:gridCol w:w="2613"/>
+        <w:gridCol w:w="2080"/>
+        <w:gridCol w:w="2125"/>
+        <w:gridCol w:w="2020"/>
       </w:tblGrid>
       <w:tr>
         <w:trPr>
@@ -2519,120 +2648,405 @@
         </w:trPr>
         <w:tc>
           <w:tcPr>
-            <w:cnfStyle w:val="001000000000" w:firstRow="0" w:lastRow="0" w:firstColumn="1" w:lastColumn="0" w:oddVBand="0" w:evenVBand="0" w:oddHBand="0" w:evenHBand="0" w:firstRowFirstColumn="0" w:firstRowLastColumn="0" w:lastRowFirstColumn="0" w:lastRowLastColumn="0"/>
-            <w:tcW w:w="2942" w:type="dxa"/>
+            <w:tcW w:w="0" w:type="auto"/>
+            <w:hideMark/>
           </w:tcPr>
           <w:p>
             <w:pPr>
-              <w:rPr>
-                <w:rFonts w:cs="Times New Roman"/>
+              <w:spacing w:line="240" w:lineRule="auto"/>
+              <w:ind w:firstLine="0"/>
+              <w:rPr>
+                <w:rFonts w:ascii="Arial" w:hAnsi="Arial" w:cs="Arial"/>
+                <w:color w:val="auto"/>
               </w:rPr>
             </w:pPr>
             <w:r>
               <w:rPr>
-                <w:rFonts w:cs="Times New Roman"/>
-              </w:rPr>
-              <w:t>Problema Actual</w:t>
+                <w:rStyle w:val="Textoennegrita"/>
+                <w:rFonts w:ascii="Arial" w:hAnsi="Arial" w:cs="Arial"/>
+              </w:rPr>
+              <w:t>Criterio de Análisis</w:t>
             </w:r>
           </w:p>
         </w:tc>
         <w:tc>
           <w:tcPr>
-            <w:tcW w:w="2943" w:type="dxa"/>
+            <w:tcW w:w="0" w:type="auto"/>
+            <w:hideMark/>
           </w:tcPr>
           <w:p>
             <w:pPr>
-              <w:cnfStyle w:val="100000000000" w:firstRow="1" w:lastRow="0" w:firstColumn="0" w:lastColumn="0" w:oddVBand="0" w:evenVBand="0" w:oddHBand="0" w:evenHBand="0" w:firstRowFirstColumn="0" w:firstRowLastColumn="0" w:lastRowFirstColumn="0" w:lastRowLastColumn="0"/>
-              <w:rPr>
-                <w:rFonts w:cs="Times New Roman"/>
+              <w:rPr>
+                <w:rFonts w:ascii="Arial" w:hAnsi="Arial" w:cs="Arial"/>
               </w:rPr>
             </w:pPr>
             <w:r>
               <w:rPr>
-                <w:rFonts w:cs="Times New Roman"/>
-              </w:rPr>
-              <w:t>Consecuencia en la Operación</w:t>
+                <w:rStyle w:val="Textoennegrita"/>
+                <w:rFonts w:ascii="Arial" w:hAnsi="Arial" w:cs="Arial"/>
+              </w:rPr>
+              <w:t>1. Necesidad Detectada</w:t>
             </w:r>
           </w:p>
         </w:tc>
         <w:tc>
           <w:tcPr>
-            <w:tcW w:w="2943" w:type="dxa"/>
+            <w:tcW w:w="0" w:type="auto"/>
+            <w:hideMark/>
           </w:tcPr>
           <w:p>
             <w:pPr>
-              <w:cnfStyle w:val="100000000000" w:firstRow="1" w:lastRow="0" w:firstColumn="0" w:lastColumn="0" w:oddVBand="0" w:evenVBand="0" w:oddHBand="0" w:evenHBand="0" w:firstRowFirstColumn="0" w:firstRowLastColumn="0" w:lastRowFirstColumn="0" w:lastRowLastColumn="0"/>
-              <w:rPr>
-                <w:rFonts w:cs="Times New Roman"/>
+              <w:rPr>
+                <w:rFonts w:ascii="Arial" w:hAnsi="Arial" w:cs="Arial"/>
               </w:rPr>
             </w:pPr>
             <w:r>
               <w:rPr>
-                <w:rFonts w:cs="Times New Roman"/>
-              </w:rPr>
-              <w:t>Solución con la Aplicación</w:t>
+                <w:rStyle w:val="Textoennegrita"/>
+                <w:rFonts w:ascii="Arial" w:hAnsi="Arial" w:cs="Arial"/>
+              </w:rPr>
+              <w:t>2. Manejo Actual (Sin Célula 6)</w:t>
+            </w:r>
+          </w:p>
+        </w:tc>
+        <w:tc>
+          <w:tcPr>
+            <w:tcW w:w="0" w:type="auto"/>
+            <w:hideMark/>
+          </w:tcPr>
+          <w:p>
+            <w:pPr>
+              <w:rPr>
+                <w:rFonts w:ascii="Arial" w:hAnsi="Arial" w:cs="Arial"/>
+              </w:rPr>
+            </w:pPr>
+            <w:r>
+              <w:rPr>
+                <w:rStyle w:val="Textoennegrita"/>
+                <w:rFonts w:ascii="Arial" w:hAnsi="Arial" w:cs="Arial"/>
+              </w:rPr>
+              <w:t>3. Solución Propuesta (Célula 6)</w:t>
             </w:r>
           </w:p>
         </w:tc>
       </w:tr>
       <w:tr>
-        <w:trPr>
-          <w:cnfStyle w:val="000000100000" w:firstRow="0" w:lastRow="0" w:firstColumn="0" w:lastColumn="0" w:oddVBand="0" w:evenVBand="0" w:oddHBand="1" w:evenHBand="0" w:firstRowFirstColumn="0" w:firstRowLastColumn="0" w:lastRowFirstColumn="0" w:lastRowLastColumn="0"/>
-        </w:trPr>
         <w:tc>
           <w:tcPr>
-            <w:cnfStyle w:val="001000000000" w:firstRow="0" w:lastRow="0" w:firstColumn="1" w:lastColumn="0" w:oddVBand="0" w:evenVBand="0" w:oddHBand="0" w:evenHBand="0" w:firstRowFirstColumn="0" w:firstRowLastColumn="0" w:lastRowFirstColumn="0" w:lastRowLastColumn="0"/>
-            <w:tcW w:w="2942" w:type="dxa"/>
+            <w:tcW w:w="0" w:type="auto"/>
+            <w:hideMark/>
           </w:tcPr>
           <w:p>
             <w:pPr>
               <w:rPr>
-                <w:rFonts w:cs="Times New Roman"/>
+                <w:rFonts w:ascii="Arial" w:hAnsi="Arial" w:cs="Arial"/>
               </w:rPr>
             </w:pPr>
             <w:r>
               <w:rPr>
-                <w:rFonts w:cs="Times New Roman"/>
-              </w:rPr>
-              <w:t>Agendamiento manual por WhatsApp y llamadas</w:t>
+                <w:rFonts w:ascii="Arial" w:hAnsi="Arial" w:cs="Arial"/>
+                <w:b/>
+                <w:bCs/>
+              </w:rPr>
+              <w:t>Enfoque de Interacción</w:t>
             </w:r>
           </w:p>
         </w:tc>
         <w:tc>
           <w:tcPr>
-            <w:tcW w:w="2943" w:type="dxa"/>
+            <w:tcW w:w="0" w:type="auto"/>
+            <w:hideMark/>
           </w:tcPr>
           <w:p>
             <w:pPr>
-              <w:cnfStyle w:val="000000100000" w:firstRow="0" w:lastRow="0" w:firstColumn="0" w:lastColumn="0" w:oddVBand="0" w:evenVBand="0" w:oddHBand="1" w:evenHBand="0" w:firstRowFirstColumn="0" w:firstRowLastColumn="0" w:lastRowFirstColumn="0" w:lastRowLastColumn="0"/>
-              <w:rPr>
-                <w:rFonts w:cs="Times New Roman"/>
+              <w:rPr>
+                <w:rFonts w:ascii="Arial" w:hAnsi="Arial" w:cs="Arial"/>
               </w:rPr>
             </w:pPr>
             <w:r>
               <w:rPr>
-                <w:rFonts w:cs="Times New Roman"/>
-              </w:rPr>
-              <w:t>Interrupciones constantes durante el servicio al cliente y errores humanos como cruces de horarios.</w:t>
+                <w:rFonts w:ascii="Arial" w:hAnsi="Arial" w:cs="Arial"/>
+              </w:rPr>
+              <w:t>Falta de "prueba social" e intercambio de experiencias reales entre cocineros.</w:t>
             </w:r>
           </w:p>
         </w:tc>
         <w:tc>
           <w:tcPr>
-            <w:tcW w:w="2943" w:type="dxa"/>
+            <w:tcW w:w="0" w:type="auto"/>
+            <w:hideMark/>
           </w:tcPr>
           <w:p>
             <w:pPr>
-              <w:cnfStyle w:val="000000100000" w:firstRow="0" w:lastRow="0" w:firstColumn="0" w:lastColumn="0" w:oddVBand="0" w:evenVBand="0" w:oddHBand="1" w:evenHBand="0" w:firstRowFirstColumn="0" w:firstRowLastColumn="0" w:lastRowFirstColumn="0" w:lastRowLastColumn="0"/>
-              <w:rPr>
-                <w:rFonts w:cs="Times New Roman"/>
+              <w:rPr>
+                <w:rFonts w:ascii="Arial" w:hAnsi="Arial" w:cs="Arial"/>
               </w:rPr>
             </w:pPr>
             <w:r>
               <w:rPr>
-                <w:rFonts w:cs="Times New Roman"/>
-              </w:rPr>
-              <w:t>Sistema de reservas en línea donde el cliente agenda de forma autónoma viendo la disponibilidad real.</w:t>
+                <w:rFonts w:ascii="Arial" w:hAnsi="Arial" w:cs="Arial"/>
+              </w:rPr>
+              <w:t>Comunicación unidireccional (la plataforma publica, el usuario solo lee).</w:t>
+            </w:r>
+          </w:p>
+        </w:tc>
+        <w:tc>
+          <w:tcPr>
+            <w:tcW w:w="0" w:type="auto"/>
+            <w:hideMark/>
+          </w:tcPr>
+          <w:p>
+            <w:pPr>
+              <w:rPr>
+                <w:rFonts w:ascii="Arial" w:hAnsi="Arial" w:cs="Arial"/>
+              </w:rPr>
+            </w:pPr>
+            <w:r>
+              <w:rPr>
+                <w:rFonts w:ascii="Arial" w:hAnsi="Arial" w:cs="Arial"/>
+              </w:rPr>
+              <w:t>Ecosistema bidireccional y participativo basado en la comunidad.</w:t>
+            </w:r>
+          </w:p>
+        </w:tc>
+      </w:tr>
+      <w:tr>
+        <w:tc>
+          <w:tcPr>
+            <w:tcW w:w="0" w:type="auto"/>
+            <w:hideMark/>
+          </w:tcPr>
+          <w:p>
+            <w:pPr>
+              <w:rPr>
+                <w:rFonts w:ascii="Arial" w:hAnsi="Arial" w:cs="Arial"/>
+              </w:rPr>
+            </w:pPr>
+            <w:r>
+              <w:rPr>
+                <w:rFonts w:ascii="Arial" w:hAnsi="Arial" w:cs="Arial"/>
+                <w:b/>
+                <w:bCs/>
+              </w:rPr>
+              <w:t>Evaluación de Recetas</w:t>
+            </w:r>
+          </w:p>
+        </w:tc>
+        <w:tc>
+          <w:tcPr>
+            <w:tcW w:w="0" w:type="auto"/>
+            <w:hideMark/>
+          </w:tcPr>
+          <w:p>
+            <w:pPr>
+              <w:rPr>
+                <w:rFonts w:ascii="Arial" w:hAnsi="Arial" w:cs="Arial"/>
+              </w:rPr>
+            </w:pPr>
+            <w:r>
+              <w:rPr>
+                <w:rFonts w:ascii="Arial" w:hAnsi="Arial" w:cs="Arial"/>
+              </w:rPr>
+              <w:t>Incertidumbre sobre la precisión, tiempo real y dificultad de una receta.</w:t>
+            </w:r>
+          </w:p>
+        </w:tc>
+        <w:tc>
+          <w:tcPr>
+            <w:tcW w:w="0" w:type="auto"/>
+            <w:hideMark/>
+          </w:tcPr>
+          <w:p>
+            <w:pPr>
+              <w:rPr>
+                <w:rFonts w:ascii="Arial" w:hAnsi="Arial" w:cs="Arial"/>
+              </w:rPr>
+            </w:pPr>
+            <w:r>
+              <w:rPr>
+                <w:rFonts w:ascii="Arial" w:hAnsi="Arial" w:cs="Arial"/>
+              </w:rPr>
+              <w:t>Imposibilidad de calificar o cuantificar el éxito de una receta.</w:t>
+            </w:r>
+          </w:p>
+        </w:tc>
+        <w:tc>
+          <w:tcPr>
+            <w:tcW w:w="0" w:type="auto"/>
+            <w:hideMark/>
+          </w:tcPr>
+          <w:p>
+            <w:pPr>
+              <w:rPr>
+                <w:rFonts w:ascii="Arial" w:hAnsi="Arial" w:cs="Arial"/>
+              </w:rPr>
+            </w:pPr>
+            <w:r>
+              <w:rPr>
+                <w:rFonts w:ascii="Arial" w:hAnsi="Arial" w:cs="Arial"/>
+              </w:rPr>
+              <w:t>Sistema de valoración numérica e intuitiva mediante escala de 1 a 5 estrellas.</w:t>
+            </w:r>
+          </w:p>
+        </w:tc>
+      </w:tr>
+      <w:tr>
+        <w:tc>
+          <w:tcPr>
+            <w:tcW w:w="0" w:type="auto"/>
+            <w:hideMark/>
+          </w:tcPr>
+          <w:p>
+            <w:pPr>
+              <w:rPr>
+                <w:rFonts w:ascii="Arial" w:hAnsi="Arial" w:cs="Arial"/>
+              </w:rPr>
+            </w:pPr>
+            <w:r>
+              <w:rPr>
+                <w:rFonts w:ascii="Arial" w:hAnsi="Arial" w:cs="Arial"/>
+                <w:b/>
+                <w:bCs/>
+              </w:rPr>
+              <w:lastRenderedPageBreak/>
+              <w:t>Retroalimentación</w:t>
+            </w:r>
+          </w:p>
+        </w:tc>
+        <w:tc>
+          <w:tcPr>
+            <w:tcW w:w="0" w:type="auto"/>
+            <w:hideMark/>
+          </w:tcPr>
+          <w:p>
+            <w:pPr>
+              <w:rPr>
+                <w:rFonts w:ascii="Arial" w:hAnsi="Arial" w:cs="Arial"/>
+              </w:rPr>
+            </w:pPr>
+            <w:r>
+              <w:rPr>
+                <w:rFonts w:ascii="Arial" w:hAnsi="Arial" w:cs="Arial"/>
+              </w:rPr>
+              <w:t>Ausencia de canal para compartir variaciones, trucos o sustitutos de ingredientes.</w:t>
+            </w:r>
+          </w:p>
+        </w:tc>
+        <w:tc>
+          <w:tcPr>
+            <w:tcW w:w="0" w:type="auto"/>
+            <w:hideMark/>
+          </w:tcPr>
+          <w:p>
+            <w:pPr>
+              <w:rPr>
+                <w:rFonts w:ascii="Arial" w:hAnsi="Arial" w:cs="Arial"/>
+              </w:rPr>
+            </w:pPr>
+            <w:r>
+              <w:rPr>
+                <w:rFonts w:ascii="Arial" w:hAnsi="Arial" w:cs="Arial"/>
+              </w:rPr>
+              <w:t>Sin mecanismos para publicar comentarios, opiniones o sugerencias.</w:t>
+            </w:r>
+          </w:p>
+        </w:tc>
+        <w:tc>
+          <w:tcPr>
+            <w:tcW w:w="0" w:type="auto"/>
+            <w:hideMark/>
+          </w:tcPr>
+          <w:p>
+            <w:pPr>
+              <w:rPr>
+                <w:rFonts w:ascii="Arial" w:hAnsi="Arial" w:cs="Arial"/>
+              </w:rPr>
+            </w:pPr>
+            <w:r>
+              <w:rPr>
+                <w:rFonts w:ascii="Arial" w:hAnsi="Arial" w:cs="Arial"/>
+              </w:rPr>
+              <w:t>Módulo de reseñas con comentarios redactados e hilos de respuesta entre usuarios.</w:t>
+            </w:r>
+          </w:p>
+        </w:tc>
+      </w:tr>
+      <w:tr>
+        <w:tc>
+          <w:tcPr>
+            <w:tcW w:w="0" w:type="auto"/>
+            <w:hideMark/>
+          </w:tcPr>
+          <w:p>
+            <w:pPr>
+              <w:rPr>
+                <w:rFonts w:ascii="Arial" w:hAnsi="Arial" w:cs="Arial"/>
+              </w:rPr>
+            </w:pPr>
+            <w:r>
+              <w:rPr>
+                <w:rFonts w:ascii="Arial" w:hAnsi="Arial" w:cs="Arial"/>
+                <w:b/>
+                <w:bCs/>
+              </w:rPr>
+              <w:t>Confianza del Usuario</w:t>
+            </w:r>
+          </w:p>
+        </w:tc>
+        <w:tc>
+          <w:tcPr>
+            <w:tcW w:w="0" w:type="auto"/>
+            <w:hideMark/>
+          </w:tcPr>
+          <w:p>
+            <w:pPr>
+              <w:rPr>
+                <w:rFonts w:ascii="Arial" w:hAnsi="Arial" w:cs="Arial"/>
+              </w:rPr>
+            </w:pPr>
+            <w:r>
+              <w:rPr>
+                <w:rFonts w:ascii="Arial" w:hAnsi="Arial" w:cs="Arial"/>
+              </w:rPr>
+              <w:t>Baja tasa de fidelización y vacilación al seleccionar un platillo para cocinar.</w:t>
+            </w:r>
+          </w:p>
+        </w:tc>
+        <w:tc>
+          <w:tcPr>
+            <w:tcW w:w="0" w:type="auto"/>
+            <w:hideMark/>
+          </w:tcPr>
+          <w:p>
+            <w:pPr>
+              <w:rPr>
+                <w:rFonts w:ascii="Arial" w:hAnsi="Arial" w:cs="Arial"/>
+              </w:rPr>
+            </w:pPr>
+            <w:r>
+              <w:rPr>
+                <w:rFonts w:ascii="Arial" w:hAnsi="Arial" w:cs="Arial"/>
+              </w:rPr>
+              <w:t>Dependencia exclusiva de la descripción estática proporcionada por la página.</w:t>
+            </w:r>
+          </w:p>
+        </w:tc>
+        <w:tc>
+          <w:tcPr>
+            <w:tcW w:w="0" w:type="auto"/>
+            <w:hideMark/>
+          </w:tcPr>
+          <w:p>
+            <w:pPr>
+              <w:rPr>
+                <w:rFonts w:ascii="Arial" w:hAnsi="Arial" w:cs="Arial"/>
+              </w:rPr>
+            </w:pPr>
+            <w:r>
+              <w:rPr>
+                <w:rFonts w:ascii="Arial" w:hAnsi="Arial" w:cs="Arial"/>
+              </w:rPr>
+              <w:t>Visualización en tiempo real de estadísticas agregadas (promedio de estrellas y número de re</w:t>
             </w:r>
           </w:p>
         </w:tc>
@@ -2640,13 +3054,7 @@
     </w:tbl>
     <w:p>
       <w:pPr>
-        <w:rPr>
-          <w:rFonts w:cs="Times New Roman"/>
-        </w:rPr>
-      </w:pPr>
-    </w:p>
-    <w:p>
-      <w:pPr>
+        <w:ind w:firstLine="0"/>
         <w:rPr>
           <w:rFonts w:cs="Times New Roman"/>
         </w:rPr>
@@ -2666,7 +3074,7 @@
           <w:szCs w:val="24"/>
         </w:rPr>
       </w:pPr>
-      <w:bookmarkStart w:id="11" w:name="_Toc242124628"/>
+      <w:bookmarkStart w:id="12" w:name="_Toc242181764"/>
       <w:r>
         <w:rPr>
           <w:rFonts w:cs="Times New Roman"/>
@@ -2675,7 +3083,7 @@
         <w:lastRenderedPageBreak/>
         <w:t>Stack tecnológico</w:t>
       </w:r>
-      <w:bookmarkEnd w:id="11"/>
+      <w:bookmarkEnd w:id="12"/>
     </w:p>
     <w:p>
       <w:pPr>
@@ -2730,7 +3138,7 @@
           <w:szCs w:val="24"/>
         </w:rPr>
       </w:pPr>
-      <w:bookmarkStart w:id="12" w:name="_Toc241140366"/>
+      <w:bookmarkStart w:id="13" w:name="_Toc241140366"/>
       <w:r>
         <w:rPr>
           <w:rFonts w:cs="Times New Roman"/>
@@ -2814,7 +3222,7 @@
         </w:rPr>
         <w:t>tecnológico</w:t>
       </w:r>
-      <w:bookmarkEnd w:id="12"/>
+      <w:bookmarkEnd w:id="13"/>
       <w:r>
         <w:rPr>
           <w:rFonts w:cs="Times New Roman"/>
@@ -2832,7 +3240,7 @@
           <w:szCs w:val="24"/>
         </w:rPr>
       </w:pPr>
-      <w:bookmarkStart w:id="13" w:name="_Toc242124629"/>
+      <w:bookmarkStart w:id="14" w:name="_Toc242181765"/>
       <w:r>
         <w:rPr>
           <w:rFonts w:cs="Times New Roman"/>
@@ -2841,7 +3249,7 @@
         <w:lastRenderedPageBreak/>
         <w:t>2. Alcance</w:t>
       </w:r>
-      <w:bookmarkEnd w:id="13"/>
+      <w:bookmarkEnd w:id="14"/>
     </w:p>
     <w:p>
       <w:pPr>
@@ -2864,7 +3272,7 @@
           <w:szCs w:val="24"/>
         </w:rPr>
       </w:pPr>
-      <w:bookmarkStart w:id="14" w:name="_Toc242124630"/>
+      <w:bookmarkStart w:id="15" w:name="_Toc242181766"/>
       <w:r>
         <w:rPr>
           <w:rFonts w:cs="Times New Roman"/>
@@ -2872,7 +3280,7 @@
         </w:rPr>
         <w:t>2.1 Inclusiones</w:t>
       </w:r>
-      <w:bookmarkEnd w:id="14"/>
+      <w:bookmarkEnd w:id="15"/>
     </w:p>
     <w:p>
       <w:pPr>
@@ -3091,7 +3499,7 @@
           <w:szCs w:val="24"/>
         </w:rPr>
       </w:pPr>
-      <w:bookmarkStart w:id="15" w:name="_Toc242124631"/>
+      <w:bookmarkStart w:id="16" w:name="_Toc242181767"/>
       <w:r>
         <w:rPr>
           <w:rFonts w:cs="Times New Roman"/>
@@ -3099,7 +3507,7 @@
         </w:rPr>
         <w:t>2.2 Exclusiones</w:t>
       </w:r>
-      <w:bookmarkEnd w:id="15"/>
+      <w:bookmarkEnd w:id="16"/>
     </w:p>
     <w:p>
       <w:pPr>
@@ -3224,18 +3632,647 @@
     </w:p>
     <w:p>
       <w:pPr>
-        <w:jc w:val="center"/>
-        <w:rPr>
-          <w:rFonts w:cs="Times New Roman"/>
-        </w:rPr>
-      </w:pPr>
-      <w:r>
-        <w:rPr>
-          <w:rFonts w:cs="Times New Roman"/>
-        </w:rPr>
+        <w:pStyle w:val="Ttulo1"/>
+      </w:pPr>
+      <w:bookmarkStart w:id="17" w:name="_Toc242181768"/>
+      <w:r>
         <w:lastRenderedPageBreak/>
         <w:t>Glosario</w:t>
       </w:r>
+      <w:bookmarkEnd w:id="17"/>
+    </w:p>
+    <w:p/>
+    <w:p/>
+    <w:p/>
+    <w:p>
+      <w:r>
+        <w:rPr>
+          <w:b/>
+          <w:bCs/>
+        </w:rPr>
+        <w:t>-</w:t>
+      </w:r>
+      <w:proofErr w:type="spellStart"/>
+      <w:r>
+        <w:rPr>
+          <w:b/>
+          <w:bCs/>
+        </w:rPr>
+        <w:t>Backend</w:t>
+      </w:r>
+      <w:proofErr w:type="spellEnd"/>
+      <w:r>
+        <w:rPr>
+          <w:b/>
+          <w:bCs/>
+        </w:rPr>
+        <w:t>:</w:t>
+      </w:r>
+      <w:r>
+        <w:t xml:space="preserve"> Capa del lado del servidor desarrollada en Java que procesa las reglas de</w:t>
+      </w:r>
+    </w:p>
+    <w:p>
+      <w:pPr>
+        <w:ind w:firstLine="0"/>
+      </w:pPr>
+      <w:r>
+        <w:t>negocio, valida la seguridad de las peticiones y c</w:t>
+      </w:r>
+      <w:r>
+        <w:t xml:space="preserve">oordina el intercambio de datos entre la interfaz </w:t>
+      </w:r>
+      <w:r>
+        <w:t>visual y la base de datos relacional de Sazón.</w:t>
+      </w:r>
+    </w:p>
+    <w:p>
+      <w:r>
+        <w:rPr>
+          <w:b/>
+          <w:bCs/>
+        </w:rPr>
+        <w:t>-Base de Datos Relacional (SQL):</w:t>
+      </w:r>
+      <w:r>
+        <w:t xml:space="preserve"> Sistema de almacenami</w:t>
+      </w:r>
+      <w:r>
+        <w:t xml:space="preserve">ento persistente y estructurado </w:t>
+      </w:r>
+      <w:r>
+        <w:t>que utiliza tablas y claves relacionales</w:t>
+      </w:r>
+      <w:r>
+        <w:t xml:space="preserve"> para guardar la información de </w:t>
+      </w:r>
+      <w:r>
+        <w:t>usuarios, calificaciones,</w:t>
+      </w:r>
+      <w:r>
+        <w:t xml:space="preserve"> </w:t>
+      </w:r>
+      <w:r>
+        <w:t>comentarios, recetas favoritas, colecciones y reportes de la comunidad.</w:t>
+      </w:r>
+    </w:p>
+    <w:p>
+      <w:r>
+        <w:t>-</w:t>
+      </w:r>
+      <w:r>
+        <w:rPr>
+          <w:b/>
+          <w:bCs/>
+        </w:rPr>
+        <w:t>CSS (</w:t>
+      </w:r>
+      <w:proofErr w:type="spellStart"/>
+      <w:r>
+        <w:rPr>
+          <w:b/>
+          <w:bCs/>
+        </w:rPr>
+        <w:t>Cascading</w:t>
+      </w:r>
+      <w:proofErr w:type="spellEnd"/>
+      <w:r>
+        <w:rPr>
+          <w:b/>
+          <w:bCs/>
+        </w:rPr>
+        <w:t xml:space="preserve"> Style </w:t>
+      </w:r>
+      <w:proofErr w:type="spellStart"/>
+      <w:r>
+        <w:rPr>
+          <w:b/>
+          <w:bCs/>
+        </w:rPr>
+        <w:t>Sheets</w:t>
+      </w:r>
+      <w:proofErr w:type="spellEnd"/>
+      <w:r>
+        <w:rPr>
+          <w:b/>
+          <w:bCs/>
+        </w:rPr>
+        <w:t>):</w:t>
+      </w:r>
+      <w:r>
+        <w:t xml:space="preserve"> Lenguaje de diseño visual utilizado para definir la</w:t>
+      </w:r>
+    </w:p>
+    <w:p>
+      <w:pPr>
+        <w:ind w:firstLine="0"/>
+      </w:pPr>
+      <w:r>
+        <w:t>presentación gráfica, colores, diseños adaptativos y</w:t>
+      </w:r>
+      <w:r>
+        <w:t xml:space="preserve"> maquetación de la interfaz web del módulo </w:t>
+      </w:r>
+      <w:r>
+        <w:t>de comunidad.</w:t>
+      </w:r>
+    </w:p>
+    <w:p>
+      <w:r>
+        <w:rPr>
+          <w:b/>
+          <w:bCs/>
+        </w:rPr>
+        <w:t>-</w:t>
+      </w:r>
+      <w:r>
+        <w:rPr>
+          <w:b/>
+          <w:bCs/>
+        </w:rPr>
+        <w:t>HTML (</w:t>
+      </w:r>
+      <w:proofErr w:type="spellStart"/>
+      <w:r>
+        <w:rPr>
+          <w:b/>
+          <w:bCs/>
+        </w:rPr>
+        <w:t>HyperText</w:t>
+      </w:r>
+      <w:proofErr w:type="spellEnd"/>
+      <w:r>
+        <w:rPr>
+          <w:b/>
+          <w:bCs/>
+        </w:rPr>
+        <w:t xml:space="preserve"> </w:t>
+      </w:r>
+      <w:proofErr w:type="spellStart"/>
+      <w:r>
+        <w:rPr>
+          <w:b/>
+          <w:bCs/>
+        </w:rPr>
+        <w:t>Markup</w:t>
+      </w:r>
+      <w:proofErr w:type="spellEnd"/>
+      <w:r>
+        <w:rPr>
+          <w:b/>
+          <w:bCs/>
+        </w:rPr>
+        <w:t xml:space="preserve"> </w:t>
+      </w:r>
+      <w:proofErr w:type="spellStart"/>
+      <w:r>
+        <w:rPr>
+          <w:b/>
+          <w:bCs/>
+        </w:rPr>
+        <w:t>Language</w:t>
+      </w:r>
+      <w:proofErr w:type="spellEnd"/>
+      <w:r>
+        <w:rPr>
+          <w:b/>
+          <w:bCs/>
+        </w:rPr>
+        <w:t>):</w:t>
+      </w:r>
+      <w:r>
+        <w:t xml:space="preserve"> Lenguaje de marcado estándar con el que se</w:t>
+      </w:r>
+      <w:r>
+        <w:t xml:space="preserve"> </w:t>
+      </w:r>
+      <w:r>
+        <w:t>construye la estructura semántica y el esqueleto de las pantallas del sistema Sazón.</w:t>
+      </w:r>
+    </w:p>
+    <w:p>
+      <w:r>
+        <w:rPr>
+          <w:b/>
+          <w:bCs/>
+        </w:rPr>
+        <w:t>-</w:t>
+      </w:r>
+      <w:r>
+        <w:rPr>
+          <w:b/>
+          <w:bCs/>
+        </w:rPr>
+        <w:t>JavaScript</w:t>
+      </w:r>
+      <w:r>
+        <w:t>: Lenguaje de programación interpretado del lado del cliente que brinda</w:t>
+      </w:r>
+    </w:p>
+    <w:p>
+      <w:pPr>
+        <w:ind w:firstLine="0"/>
+      </w:pPr>
+      <w:r>
+        <w:t>dinamismo, interactividad en tiempo real y validaciones dentro de la experiencia de</w:t>
+      </w:r>
+      <w:r>
+        <w:t xml:space="preserve"> </w:t>
+      </w:r>
+      <w:r>
+        <w:t>usuario.</w:t>
+      </w:r>
+    </w:p>
+    <w:p>
+      <w:r>
+        <w:rPr>
+          <w:b/>
+          <w:bCs/>
+        </w:rPr>
+        <w:t>-</w:t>
+      </w:r>
+      <w:proofErr w:type="spellStart"/>
+      <w:r>
+        <w:rPr>
+          <w:b/>
+          <w:bCs/>
+        </w:rPr>
+        <w:t>localStorage</w:t>
+      </w:r>
+      <w:proofErr w:type="spellEnd"/>
+      <w:r>
+        <w:rPr>
+          <w:b/>
+          <w:bCs/>
+        </w:rPr>
+        <w:t>:</w:t>
+      </w:r>
+      <w:r>
+        <w:t xml:space="preserve"> Mecanismo de almacenamiento web del navegador que permite la</w:t>
+      </w:r>
+    </w:p>
+    <w:p>
+      <w:pPr>
+        <w:ind w:firstLine="0"/>
+      </w:pPr>
+      <w:r>
+        <w:t xml:space="preserve">persistencia temporal de datos directamente en el dispositivo </w:t>
+      </w:r>
+      <w:r>
+        <w:t xml:space="preserve">del usuario, útil para mantener </w:t>
+      </w:r>
+      <w:r>
+        <w:t>sesiones activas o guardar preferencias rápidamente sin sobrecargar el servidor.</w:t>
+      </w:r>
+    </w:p>
+    <w:p>
+      <w:r>
+        <w:lastRenderedPageBreak/>
+        <w:t>Modelo de Clientes / Entidad-Relación: Representación lógica y conceptual que define</w:t>
+      </w:r>
+      <w:r>
+        <w:t xml:space="preserve"> </w:t>
+      </w:r>
+      <w:r>
+        <w:t>las tablas, atributos y relaciones entre las en</w:t>
+      </w:r>
+      <w:r>
+        <w:t xml:space="preserve">tidades del módulo de comunidad (como </w:t>
+      </w:r>
+      <w:r>
+        <w:t>calificaciones, comentarios, colecciones, favoritos y reportes).</w:t>
+      </w:r>
+    </w:p>
+    <w:p>
+      <w:r>
+        <w:rPr>
+          <w:b/>
+          <w:bCs/>
+        </w:rPr>
+        <w:t xml:space="preserve">-SRS (Software </w:t>
+      </w:r>
+      <w:proofErr w:type="spellStart"/>
+      <w:r>
+        <w:rPr>
+          <w:b/>
+          <w:bCs/>
+        </w:rPr>
+        <w:t>Requirements</w:t>
+      </w:r>
+      <w:proofErr w:type="spellEnd"/>
+      <w:r>
+        <w:rPr>
+          <w:b/>
+          <w:bCs/>
+        </w:rPr>
+        <w:t xml:space="preserve"> </w:t>
+      </w:r>
+      <w:proofErr w:type="spellStart"/>
+      <w:r>
+        <w:rPr>
+          <w:b/>
+          <w:bCs/>
+        </w:rPr>
+        <w:t>Specification</w:t>
+      </w:r>
+      <w:proofErr w:type="spellEnd"/>
+      <w:r>
+        <w:rPr>
+          <w:b/>
+          <w:bCs/>
+        </w:rPr>
+        <w:t>):</w:t>
+      </w:r>
+      <w:r>
+        <w:t xml:space="preserve"> Docume</w:t>
+      </w:r>
+      <w:r>
+        <w:t xml:space="preserve">nto formal de especificación de </w:t>
+      </w:r>
+      <w:r>
+        <w:t>requisitos de software que establece los requerimientos funcional</w:t>
+      </w:r>
+      <w:r>
+        <w:t xml:space="preserve">es, no funcionales, de alcance </w:t>
+      </w:r>
+      <w:r>
+        <w:t>de arquitectura para la Célula 6.</w:t>
+      </w:r>
+    </w:p>
+    <w:p>
+      <w:r>
+        <w:rPr>
+          <w:b/>
+          <w:bCs/>
+        </w:rPr>
+        <w:t>-</w:t>
+      </w:r>
+      <w:proofErr w:type="spellStart"/>
+      <w:r>
+        <w:rPr>
+          <w:b/>
+          <w:bCs/>
+        </w:rPr>
+        <w:t>Stack</w:t>
+      </w:r>
+      <w:proofErr w:type="spellEnd"/>
+      <w:r>
+        <w:rPr>
+          <w:b/>
+          <w:bCs/>
+        </w:rPr>
+        <w:t xml:space="preserve"> Tecnológico:</w:t>
+      </w:r>
+      <w:r>
+        <w:t xml:space="preserve"> Conjunto integrado de herramientas, lenguajes de programación</w:t>
+      </w:r>
+      <w:r>
+        <w:t xml:space="preserve"> </w:t>
+      </w:r>
+      <w:r>
+        <w:t>(HTML, CSS, JavaScript, Java, SQL) y tecnologías de al</w:t>
+      </w:r>
+      <w:r>
+        <w:t xml:space="preserve">macenamiento seleccionadas para </w:t>
+      </w:r>
+      <w:r>
+        <w:t>implementar el módulo de comunidad.</w:t>
+      </w:r>
+    </w:p>
+    <w:p/>
+    <w:p>
+      <w:pPr>
+        <w:pStyle w:val="Ttulo2"/>
+      </w:pPr>
+      <w:bookmarkStart w:id="18" w:name="_Toc242181769"/>
+      <w:r>
+        <w:t>Términos No Técnicos</w:t>
+      </w:r>
+      <w:bookmarkEnd w:id="18"/>
+    </w:p>
+    <w:p>
+      <w:r>
+        <w:rPr>
+          <w:b/>
+          <w:bCs/>
+        </w:rPr>
+        <w:t>-</w:t>
+      </w:r>
+      <w:r>
+        <w:rPr>
+          <w:b/>
+          <w:bCs/>
+        </w:rPr>
+        <w:t>Célula de Desarrollo:</w:t>
+      </w:r>
+      <w:r>
+        <w:t xml:space="preserve"> Equipo interdisciplinario de trabajo asignado de forma</w:t>
+      </w:r>
+    </w:p>
+    <w:p>
+      <w:pPr>
+        <w:ind w:firstLine="0"/>
+      </w:pPr>
+      <w:r>
+        <w:t>especializada a un componente específico dentro del proyecto macro Sazón, como la Célula</w:t>
+      </w:r>
+      <w:r>
+        <w:t xml:space="preserve"> </w:t>
+      </w:r>
+      <w:r>
+        <w:t>6</w:t>
+      </w:r>
+      <w:r>
+        <w:t xml:space="preserve"> </w:t>
+      </w:r>
+      <w:r>
+        <w:t>encargada del módulo de Comunidad y Valoraciones.</w:t>
+      </w:r>
+    </w:p>
+    <w:p>
+      <w:r>
+        <w:rPr>
+          <w:b/>
+          <w:bCs/>
+        </w:rPr>
+        <w:t>-</w:t>
+      </w:r>
+      <w:r>
+        <w:rPr>
+          <w:b/>
+          <w:bCs/>
+        </w:rPr>
+        <w:t>Colección de Recetas:</w:t>
+      </w:r>
+      <w:r>
+        <w:t xml:space="preserve"> Agrupación personalizada o temática creada por un usuari</w:t>
+      </w:r>
+      <w:r>
+        <w:t xml:space="preserve">o para </w:t>
+      </w:r>
+      <w:r>
+        <w:t>organizar, almacenar y administrar sus recetas guardadas o preferidas dentro de la plataforma.</w:t>
+      </w:r>
+    </w:p>
+    <w:p>
+      <w:r>
+        <w:rPr>
+          <w:b/>
+          <w:bCs/>
+        </w:rPr>
+        <w:t>-</w:t>
+      </w:r>
+      <w:r>
+        <w:rPr>
+          <w:b/>
+          <w:bCs/>
+        </w:rPr>
+        <w:t>Comunidad y Valoraciones:</w:t>
+      </w:r>
+      <w:r>
+        <w:t xml:space="preserve"> Ecosistema interactivo dentro de la plataforma</w:t>
+      </w:r>
+    </w:p>
+    <w:p>
+      <w:pPr>
+        <w:ind w:firstLine="0"/>
+      </w:pPr>
+      <w:r>
+        <w:t>gastronómica donde los usuarios registrados comparten sus o</w:t>
+      </w:r>
+      <w:r>
+        <w:t xml:space="preserve">piniones, asignan puntuaciones, </w:t>
+      </w:r>
+      <w:r>
+        <w:t>guardan recetas y crean hábitos de convivencia digital.</w:t>
+      </w:r>
+    </w:p>
+    <w:p>
+      <w:r>
+        <w:rPr>
+          <w:b/>
+          <w:bCs/>
+        </w:rPr>
+        <w:t>-</w:t>
+      </w:r>
+      <w:r>
+        <w:rPr>
+          <w:b/>
+          <w:bCs/>
+        </w:rPr>
+        <w:t>Fidelización de Usuarios:</w:t>
+      </w:r>
+      <w:r>
+        <w:t xml:space="preserve"> Estrategia para fomentar la retención y frecuencia de uso</w:t>
+      </w:r>
+      <w:r>
+        <w:t xml:space="preserve"> </w:t>
+      </w:r>
+      <w:r>
+        <w:t>mediante la creación de espacios interactivos, pertenencia y generación de valor</w:t>
+      </w:r>
+      <w:r>
+        <w:t xml:space="preserve"> </w:t>
+      </w:r>
+      <w:r>
+        <w:t>continuo.</w:t>
+      </w:r>
+    </w:p>
+    <w:p>
+      <w:r>
+        <w:rPr>
+          <w:b/>
+          <w:bCs/>
+        </w:rPr>
+        <w:lastRenderedPageBreak/>
+        <w:t>-</w:t>
+      </w:r>
+      <w:r>
+        <w:rPr>
+          <w:b/>
+          <w:bCs/>
+        </w:rPr>
+        <w:t>Prueba Social:</w:t>
+      </w:r>
+      <w:r>
+        <w:t xml:space="preserve"> Fenómeno psicológico y social donde los usuarios validan la calidad y</w:t>
+      </w:r>
+      <w:r>
+        <w:t xml:space="preserve"> </w:t>
+      </w:r>
+      <w:r>
+        <w:t>confiabilidad de una receta basándose en las experiencias, res</w:t>
+      </w:r>
+      <w:r>
+        <w:t xml:space="preserve">eñas y calificaciones otorgadas </w:t>
+      </w:r>
+      <w:r>
+        <w:t>previamente por otros cocineros.</w:t>
+      </w:r>
+    </w:p>
+    <w:p>
+      <w:r>
+        <w:rPr>
+          <w:b/>
+          <w:bCs/>
+        </w:rPr>
+        <w:t>-</w:t>
+      </w:r>
+      <w:r>
+        <w:rPr>
+          <w:b/>
+          <w:bCs/>
+        </w:rPr>
+        <w:t>Reporte de Contenido:</w:t>
+      </w:r>
+      <w:r>
+        <w:t xml:space="preserve"> Mecanismo mediante el cual los miembros de la comunidad</w:t>
+      </w:r>
+      <w:r>
+        <w:t xml:space="preserve"> </w:t>
+      </w:r>
+      <w:r>
+        <w:t>notifican a la plataforma sobre comentarios o publicaciones que incumplen las normas de</w:t>
+      </w:r>
+      <w:r>
+        <w:t xml:space="preserve"> </w:t>
+      </w:r>
+      <w:r>
+        <w:t>convivencia o afectan la calidad del recetario.</w:t>
+      </w:r>
+    </w:p>
+    <w:p>
+      <w:r>
+        <w:rPr>
+          <w:b/>
+          <w:bCs/>
+        </w:rPr>
+        <w:t>-</w:t>
+      </w:r>
+      <w:r>
+        <w:rPr>
+          <w:b/>
+          <w:bCs/>
+        </w:rPr>
+        <w:t>Reseña / Comentario Constructivo:</w:t>
+      </w:r>
+      <w:r>
+        <w:t xml:space="preserve"> Retroalimentación en texto que aporta valor</w:t>
+      </w:r>
+    </w:p>
+    <w:p>
+      <w:pPr>
+        <w:ind w:firstLine="0"/>
+      </w:pPr>
+      <w:r>
+        <w:t>adicional a una receta, sugiriendo posibles sustituciones de ingredientes, variaciones de tiempo o</w:t>
+      </w:r>
+      <w:r>
+        <w:t xml:space="preserve"> </w:t>
+      </w:r>
+      <w:r>
+        <w:t>niveles reales de dificultad.</w:t>
+      </w:r>
     </w:p>
     <w:p>
       <w:pPr>
@@ -3260,897 +4297,111 @@
           <w:rFonts w:cs="Times New Roman"/>
         </w:rPr>
       </w:pPr>
-      <w:r>
-        <w:rPr>
-          <w:rFonts w:cs="Times New Roman"/>
-        </w:rPr>
-        <w:t>-</w:t>
-      </w:r>
+    </w:p>
+    <w:p>
+      <w:pPr>
+        <w:jc w:val="center"/>
+        <w:rPr>
+          <w:rFonts w:cs="Times New Roman"/>
+        </w:rPr>
+      </w:pPr>
+    </w:p>
+    <w:p>
+      <w:pPr>
+        <w:jc w:val="center"/>
+        <w:rPr>
+          <w:rFonts w:cs="Times New Roman"/>
+        </w:rPr>
+      </w:pPr>
+    </w:p>
+    <w:p>
+      <w:pPr>
+        <w:jc w:val="center"/>
+        <w:rPr>
+          <w:rFonts w:cs="Times New Roman"/>
+        </w:rPr>
+      </w:pPr>
+    </w:p>
+    <w:p>
+      <w:pPr>
+        <w:jc w:val="center"/>
+        <w:rPr>
+          <w:rFonts w:cs="Times New Roman"/>
+        </w:rPr>
+      </w:pPr>
+    </w:p>
+    <w:p>
+      <w:pPr>
+        <w:jc w:val="center"/>
+        <w:rPr>
+          <w:rFonts w:cs="Times New Roman"/>
+        </w:rPr>
+      </w:pPr>
+    </w:p>
+    <w:p>
+      <w:pPr>
+        <w:jc w:val="center"/>
+        <w:rPr>
+          <w:rFonts w:cs="Times New Roman"/>
+        </w:rPr>
+      </w:pPr>
+    </w:p>
+    <w:p>
+      <w:pPr>
+        <w:jc w:val="center"/>
+        <w:rPr>
+          <w:rFonts w:cs="Times New Roman"/>
+        </w:rPr>
+      </w:pPr>
+    </w:p>
+    <w:p>
+      <w:pPr>
+        <w:jc w:val="center"/>
+        <w:rPr>
+          <w:rFonts w:cs="Times New Roman"/>
+        </w:rPr>
+      </w:pPr>
+    </w:p>
+    <w:p>
+      <w:pPr>
+        <w:spacing w:after="160" w:line="278" w:lineRule="auto"/>
+        <w:ind w:firstLine="0"/>
+        <w:rPr>
+          <w:rFonts w:cs="Times New Roman"/>
+        </w:rPr>
+      </w:pPr>
+      <w:r>
+        <w:rPr>
+          <w:rFonts w:cs="Times New Roman"/>
+        </w:rPr>
+        <w:br w:type="page"/>
+      </w:r>
+    </w:p>
+    <w:p>
+      <w:pPr>
+        <w:pStyle w:val="Ttulo1"/>
+        <w:rPr>
+          <w:lang w:val="en-US"/>
+        </w:rPr>
+      </w:pPr>
+      <w:bookmarkStart w:id="19" w:name="_Toc242181770"/>
       <w:proofErr w:type="spellStart"/>
       <w:r>
         <w:rPr>
-          <w:rFonts w:cs="Times New Roman"/>
-        </w:rPr>
-        <w:t>Backend</w:t>
-      </w:r>
-      <w:proofErr w:type="spellEnd"/>
-      <w:r>
-        <w:rPr>
-          <w:rFonts w:cs="Times New Roman"/>
-        </w:rPr>
-        <w:t>: Capa del lado del servidor desarrollada en Java que procesa las reglas de</w:t>
-      </w:r>
-    </w:p>
-    <w:p>
-      <w:pPr>
-        <w:jc w:val="center"/>
-        <w:rPr>
-          <w:rFonts w:cs="Times New Roman"/>
-        </w:rPr>
-      </w:pPr>
-      <w:r>
-        <w:rPr>
-          <w:rFonts w:cs="Times New Roman"/>
-        </w:rPr>
-        <w:t>negocio, valida la seguridad de las peticiones y c</w:t>
-      </w:r>
-      <w:r>
-        <w:rPr>
-          <w:rFonts w:cs="Times New Roman"/>
-        </w:rPr>
-        <w:t xml:space="preserve">oordina el intercambio de datos entre la interfaz </w:t>
-      </w:r>
-      <w:r>
-        <w:rPr>
-          <w:rFonts w:cs="Times New Roman"/>
-        </w:rPr>
-        <w:t>visual y la base de datos relacional de Sazón.</w:t>
-      </w:r>
-    </w:p>
-    <w:p>
-      <w:pPr>
-        <w:ind w:left="708" w:firstLine="12"/>
-        <w:rPr>
-          <w:rFonts w:cs="Times New Roman"/>
-        </w:rPr>
-      </w:pPr>
-      <w:r>
-        <w:rPr>
-          <w:rFonts w:cs="Times New Roman"/>
-        </w:rPr>
-        <w:t>-</w:t>
-      </w:r>
-      <w:r>
-        <w:rPr>
-          <w:rFonts w:cs="Times New Roman"/>
-        </w:rPr>
-        <w:t>Base de Datos Relacional (SQL): Sistema de almacenami</w:t>
-      </w:r>
-      <w:r>
-        <w:rPr>
-          <w:rFonts w:cs="Times New Roman"/>
-        </w:rPr>
-        <w:t xml:space="preserve">ento persistente y estructurado </w:t>
-      </w:r>
-      <w:r>
-        <w:rPr>
-          <w:rFonts w:cs="Times New Roman"/>
-        </w:rPr>
-        <w:t>que utiliza tablas y claves relacionales</w:t>
-      </w:r>
-      <w:r>
-        <w:rPr>
-          <w:rFonts w:cs="Times New Roman"/>
-        </w:rPr>
-        <w:t xml:space="preserve"> para guardar la información de </w:t>
-      </w:r>
-      <w:r>
-        <w:rPr>
-          <w:rFonts w:cs="Times New Roman"/>
-        </w:rPr>
-        <w:t>usuarios, calificaciones,</w:t>
-      </w:r>
-      <w:r>
-        <w:rPr>
-          <w:rFonts w:cs="Times New Roman"/>
-        </w:rPr>
-        <w:t xml:space="preserve"> </w:t>
-      </w:r>
-      <w:r>
-        <w:rPr>
-          <w:rFonts w:cs="Times New Roman"/>
-        </w:rPr>
-        <w:t>comentarios, recetas favoritas, colecciones y reportes de la comunidad.</w:t>
-      </w:r>
-    </w:p>
-    <w:p>
-      <w:pPr>
-        <w:rPr>
-          <w:rFonts w:cs="Times New Roman"/>
-        </w:rPr>
-      </w:pPr>
-      <w:r>
-        <w:rPr>
-          <w:rFonts w:cs="Times New Roman"/>
-        </w:rPr>
-        <w:t>-</w:t>
-      </w:r>
-      <w:r>
-        <w:rPr>
-          <w:rFonts w:cs="Times New Roman"/>
-        </w:rPr>
-        <w:t>CSS (</w:t>
-      </w:r>
-      <w:proofErr w:type="spellStart"/>
-      <w:r>
-        <w:rPr>
-          <w:rFonts w:cs="Times New Roman"/>
-        </w:rPr>
-        <w:t>Cascading</w:t>
-      </w:r>
-      <w:proofErr w:type="spellEnd"/>
-      <w:r>
-        <w:rPr>
-          <w:rFonts w:cs="Times New Roman"/>
-        </w:rPr>
-        <w:t xml:space="preserve"> Style </w:t>
-      </w:r>
-      <w:proofErr w:type="spellStart"/>
-      <w:r>
-        <w:rPr>
-          <w:rFonts w:cs="Times New Roman"/>
-        </w:rPr>
-        <w:t>Sheets</w:t>
-      </w:r>
-      <w:proofErr w:type="spellEnd"/>
-      <w:r>
-        <w:rPr>
-          <w:rFonts w:cs="Times New Roman"/>
-        </w:rPr>
-        <w:t>): Lenguaje de diseño visual utilizado para definir la</w:t>
-      </w:r>
-    </w:p>
-    <w:p>
-      <w:pPr>
-        <w:jc w:val="center"/>
-        <w:rPr>
-          <w:rFonts w:cs="Times New Roman"/>
-        </w:rPr>
-      </w:pPr>
-      <w:r>
-        <w:rPr>
-          <w:rFonts w:cs="Times New Roman"/>
-        </w:rPr>
-        <w:t>presentación gráfica, colores, diseños adaptativos y</w:t>
-      </w:r>
-      <w:r>
-        <w:rPr>
-          <w:rFonts w:cs="Times New Roman"/>
-        </w:rPr>
-        <w:t xml:space="preserve"> maquetación de la interfaz web del módulo </w:t>
-      </w:r>
-      <w:r>
-        <w:rPr>
-          <w:rFonts w:cs="Times New Roman"/>
-        </w:rPr>
-        <w:t>de comunidad.</w:t>
-      </w:r>
-    </w:p>
-    <w:p>
-      <w:pPr>
-        <w:jc w:val="center"/>
-        <w:rPr>
-          <w:rFonts w:cs="Times New Roman"/>
-        </w:rPr>
-      </w:pPr>
-      <w:r>
-        <w:rPr>
-          <w:rFonts w:cs="Times New Roman"/>
-        </w:rPr>
-        <w:t>HTML (</w:t>
-      </w:r>
-      <w:proofErr w:type="spellStart"/>
-      <w:r>
-        <w:rPr>
-          <w:rFonts w:cs="Times New Roman"/>
-        </w:rPr>
-        <w:t>HyperText</w:t>
-      </w:r>
-      <w:proofErr w:type="spellEnd"/>
-      <w:r>
-        <w:rPr>
-          <w:rFonts w:cs="Times New Roman"/>
-        </w:rPr>
-        <w:t xml:space="preserve"> </w:t>
-      </w:r>
-      <w:proofErr w:type="spellStart"/>
-      <w:r>
-        <w:rPr>
-          <w:rFonts w:cs="Times New Roman"/>
-        </w:rPr>
-        <w:t>Markup</w:t>
-      </w:r>
-      <w:proofErr w:type="spellEnd"/>
-      <w:r>
-        <w:rPr>
-          <w:rFonts w:cs="Times New Roman"/>
-        </w:rPr>
-        <w:t xml:space="preserve"> </w:t>
-      </w:r>
-      <w:proofErr w:type="spellStart"/>
-      <w:r>
-        <w:rPr>
-          <w:rFonts w:cs="Times New Roman"/>
-        </w:rPr>
-        <w:t>Language</w:t>
-      </w:r>
-      <w:proofErr w:type="spellEnd"/>
-      <w:r>
-        <w:rPr>
-          <w:rFonts w:cs="Times New Roman"/>
-        </w:rPr>
-        <w:t>): Lenguaje de marcado estándar con el que se</w:t>
-      </w:r>
-    </w:p>
-    <w:p>
-      <w:pPr>
-        <w:jc w:val="center"/>
-        <w:rPr>
-          <w:rFonts w:cs="Times New Roman"/>
-        </w:rPr>
-      </w:pPr>
-      <w:r>
-        <w:rPr>
-          <w:rFonts w:cs="Times New Roman"/>
-        </w:rPr>
-        <w:t>construye la estructura semántica y el esqueleto de las pantallas del sistema Sazón.</w:t>
-      </w:r>
-    </w:p>
-    <w:p>
-      <w:pPr>
-        <w:jc w:val="center"/>
-        <w:rPr>
-          <w:rFonts w:cs="Times New Roman"/>
-        </w:rPr>
-      </w:pPr>
-      <w:r>
-        <w:rPr>
-          <w:rFonts w:cs="Times New Roman"/>
-        </w:rPr>
-        <w:t>JavaScript: Lenguaje de programación interpretado del lado del cliente que brinda</w:t>
-      </w:r>
-    </w:p>
-    <w:p>
-      <w:pPr>
-        <w:jc w:val="center"/>
-        <w:rPr>
-          <w:rFonts w:cs="Times New Roman"/>
-        </w:rPr>
-      </w:pPr>
-      <w:r>
-        <w:rPr>
-          <w:rFonts w:cs="Times New Roman"/>
-        </w:rPr>
-        <w:t>dinamismo, interactividad en tiempo real y validaciones dentro de la experiencia de usuario.</w:t>
-      </w:r>
-    </w:p>
-    <w:p>
-      <w:pPr>
-        <w:jc w:val="center"/>
-        <w:rPr>
-          <w:rFonts w:cs="Times New Roman"/>
-        </w:rPr>
-      </w:pPr>
-      <w:proofErr w:type="spellStart"/>
-      <w:r>
-        <w:rPr>
-          <w:rFonts w:cs="Times New Roman"/>
-        </w:rPr>
-        <w:t>localStorage</w:t>
-      </w:r>
-      <w:proofErr w:type="spellEnd"/>
-      <w:r>
-        <w:rPr>
-          <w:rFonts w:cs="Times New Roman"/>
-        </w:rPr>
-        <w:t>: Mecanismo de almacenamiento web del navegador que permite la</w:t>
-      </w:r>
-    </w:p>
-    <w:p>
-      <w:pPr>
-        <w:ind w:left="708" w:firstLine="12"/>
-        <w:jc w:val="center"/>
-        <w:rPr>
-          <w:rFonts w:cs="Times New Roman"/>
-        </w:rPr>
-      </w:pPr>
-      <w:r>
-        <w:rPr>
-          <w:rFonts w:cs="Times New Roman"/>
-        </w:rPr>
-        <w:t xml:space="preserve">persistencia temporal de datos directamente en el dispositivo </w:t>
-      </w:r>
-      <w:r>
-        <w:rPr>
-          <w:rFonts w:cs="Times New Roman"/>
-        </w:rPr>
-        <w:t xml:space="preserve">del usuario, útil para mantener </w:t>
-      </w:r>
-      <w:r>
-        <w:rPr>
-          <w:rFonts w:cs="Times New Roman"/>
-        </w:rPr>
-        <w:t>sesiones activas o guardar preferencias rápidamente sin sobrecargar el servidor.</w:t>
-      </w:r>
-    </w:p>
-    <w:p>
-      <w:pPr>
-        <w:jc w:val="center"/>
-        <w:rPr>
-          <w:rFonts w:cs="Times New Roman"/>
-        </w:rPr>
-      </w:pPr>
-      <w:r>
-        <w:rPr>
-          <w:rFonts w:cs="Times New Roman"/>
-        </w:rPr>
-        <w:t>Modelo de Clientes / Entidad-Relación: Representación lógica y conceptual que define</w:t>
-      </w:r>
-    </w:p>
-    <w:p>
-      <w:pPr>
-        <w:jc w:val="center"/>
-        <w:rPr>
-          <w:rFonts w:cs="Times New Roman"/>
-        </w:rPr>
-      </w:pPr>
-      <w:r>
-        <w:rPr>
-          <w:rFonts w:cs="Times New Roman"/>
-        </w:rPr>
-        <w:lastRenderedPageBreak/>
-        <w:t>las tablas, atributos y relaciones entre las en</w:t>
-      </w:r>
-      <w:r>
-        <w:rPr>
-          <w:rFonts w:cs="Times New Roman"/>
-        </w:rPr>
-        <w:t xml:space="preserve">tidades del módulo de comunidad (como </w:t>
-      </w:r>
-      <w:r>
-        <w:rPr>
-          <w:rFonts w:cs="Times New Roman"/>
-        </w:rPr>
-        <w:t>calificaciones, comentarios, colecciones, favoritos y reportes).</w:t>
-      </w:r>
-    </w:p>
-    <w:p>
-      <w:pPr>
-        <w:ind w:left="708" w:firstLine="12"/>
-        <w:jc w:val="center"/>
-        <w:rPr>
-          <w:rFonts w:cs="Times New Roman"/>
-        </w:rPr>
-      </w:pPr>
-      <w:r>
-        <w:rPr>
-          <w:rFonts w:cs="Times New Roman"/>
-        </w:rPr>
-        <w:t>-</w:t>
-      </w:r>
-      <w:r>
-        <w:rPr>
-          <w:rFonts w:cs="Times New Roman"/>
-        </w:rPr>
-        <w:t xml:space="preserve">SRS (Software </w:t>
-      </w:r>
-      <w:proofErr w:type="spellStart"/>
-      <w:r>
-        <w:rPr>
-          <w:rFonts w:cs="Times New Roman"/>
-        </w:rPr>
-        <w:t>Requirements</w:t>
-      </w:r>
-      <w:proofErr w:type="spellEnd"/>
-      <w:r>
-        <w:rPr>
-          <w:rFonts w:cs="Times New Roman"/>
-        </w:rPr>
-        <w:t xml:space="preserve"> </w:t>
-      </w:r>
-      <w:proofErr w:type="spellStart"/>
-      <w:r>
-        <w:rPr>
-          <w:rFonts w:cs="Times New Roman"/>
-        </w:rPr>
-        <w:t>Specification</w:t>
-      </w:r>
-      <w:proofErr w:type="spellEnd"/>
-      <w:r>
-        <w:rPr>
-          <w:rFonts w:cs="Times New Roman"/>
-        </w:rPr>
-        <w:t>): Docume</w:t>
-      </w:r>
-      <w:r>
-        <w:rPr>
-          <w:rFonts w:cs="Times New Roman"/>
-        </w:rPr>
-        <w:t xml:space="preserve">nto formal de especificación de </w:t>
-      </w:r>
-      <w:r>
-        <w:rPr>
-          <w:rFonts w:cs="Times New Roman"/>
-        </w:rPr>
-        <w:t>requisitos de software que establece los requerimientos funcional</w:t>
-      </w:r>
-      <w:r>
-        <w:rPr>
-          <w:rFonts w:cs="Times New Roman"/>
-        </w:rPr>
-        <w:t xml:space="preserve">es, no funcionales, de alcance </w:t>
-      </w:r>
-      <w:r>
-        <w:rPr>
-          <w:rFonts w:cs="Times New Roman"/>
-        </w:rPr>
-        <w:t>de arquitectura para la Célula 6.</w:t>
-      </w:r>
-    </w:p>
-    <w:p>
-      <w:pPr>
-        <w:jc w:val="center"/>
-        <w:rPr>
-          <w:rFonts w:cs="Times New Roman"/>
-        </w:rPr>
-      </w:pPr>
-      <w:r>
-        <w:rPr>
-          <w:rFonts w:cs="Times New Roman"/>
-        </w:rPr>
-        <w:t>-</w:t>
-      </w:r>
-      <w:proofErr w:type="spellStart"/>
-      <w:r>
-        <w:rPr>
-          <w:rFonts w:cs="Times New Roman"/>
-        </w:rPr>
-        <w:t>Stack</w:t>
-      </w:r>
-      <w:proofErr w:type="spellEnd"/>
-      <w:r>
-        <w:rPr>
-          <w:rFonts w:cs="Times New Roman"/>
-        </w:rPr>
-        <w:t xml:space="preserve"> Tecnológico: Conjunto integrado de herramientas, lenguajes de programación</w:t>
-      </w:r>
-    </w:p>
-    <w:p>
-      <w:pPr>
-        <w:jc w:val="center"/>
-        <w:rPr>
-          <w:rFonts w:cs="Times New Roman"/>
-        </w:rPr>
-      </w:pPr>
-      <w:r>
-        <w:rPr>
-          <w:rFonts w:cs="Times New Roman"/>
-        </w:rPr>
-        <w:t>(HTML, CSS, JavaScript, Java, SQL) y tecnologías de al</w:t>
-      </w:r>
-      <w:r>
-        <w:rPr>
-          <w:rFonts w:cs="Times New Roman"/>
-        </w:rPr>
-        <w:t xml:space="preserve">macenamiento seleccionadas para </w:t>
-      </w:r>
-      <w:r>
-        <w:rPr>
-          <w:rFonts w:cs="Times New Roman"/>
-        </w:rPr>
-        <w:t>implementar el módulo de comunidad.</w:t>
-      </w:r>
-    </w:p>
-    <w:p>
-      <w:pPr>
-        <w:jc w:val="center"/>
-        <w:rPr>
-          <w:rFonts w:cs="Times New Roman"/>
-        </w:rPr>
-      </w:pPr>
-      <w:r>
-        <w:rPr>
-          <w:rFonts w:cs="Times New Roman"/>
-        </w:rPr>
-        <w:t>Términos No Técnicos</w:t>
-      </w:r>
-    </w:p>
-    <w:p>
-      <w:pPr>
-        <w:jc w:val="center"/>
-        <w:rPr>
-          <w:rFonts w:cs="Times New Roman"/>
-        </w:rPr>
-      </w:pPr>
-      <w:r>
-        <w:rPr>
-          <w:rFonts w:cs="Times New Roman"/>
-        </w:rPr>
-        <w:t>Célula de Desarrollo: Equipo interdisciplinario de trabajo asignado de forma</w:t>
-      </w:r>
-    </w:p>
-    <w:p>
-      <w:pPr>
-        <w:jc w:val="center"/>
-        <w:rPr>
-          <w:rFonts w:cs="Times New Roman"/>
-        </w:rPr>
-      </w:pPr>
-      <w:r>
-        <w:rPr>
-          <w:rFonts w:cs="Times New Roman"/>
-        </w:rPr>
-        <w:t>especializada a un componente específico dentro del proyecto macro Sazón, como la Célula 6</w:t>
-      </w:r>
-    </w:p>
-    <w:p>
-      <w:pPr>
-        <w:jc w:val="center"/>
-        <w:rPr>
-          <w:rFonts w:cs="Times New Roman"/>
-        </w:rPr>
-      </w:pPr>
-      <w:r>
-        <w:rPr>
-          <w:rFonts w:cs="Times New Roman"/>
-        </w:rPr>
-        <w:t>encargada del módulo de Comunidad y Valoraciones.</w:t>
-      </w:r>
-    </w:p>
-    <w:p>
-      <w:pPr>
-        <w:ind w:left="708" w:firstLine="12"/>
-        <w:jc w:val="center"/>
-        <w:rPr>
-          <w:rFonts w:cs="Times New Roman"/>
-        </w:rPr>
-      </w:pPr>
-      <w:r>
-        <w:rPr>
-          <w:rFonts w:cs="Times New Roman"/>
-        </w:rPr>
-        <w:t>Colección de Recetas: Agrupación personalizada o temática creada por un usuari</w:t>
-      </w:r>
-      <w:r>
-        <w:rPr>
-          <w:rFonts w:cs="Times New Roman"/>
-        </w:rPr>
-        <w:t xml:space="preserve">o para </w:t>
-      </w:r>
-      <w:r>
-        <w:rPr>
-          <w:rFonts w:cs="Times New Roman"/>
-        </w:rPr>
-        <w:t>organizar, almacenar y administrar sus recetas guardadas o preferidas dentro de la plataforma.</w:t>
-      </w:r>
-    </w:p>
-    <w:p>
-      <w:pPr>
-        <w:jc w:val="center"/>
-        <w:rPr>
-          <w:rFonts w:cs="Times New Roman"/>
-        </w:rPr>
-      </w:pPr>
-    </w:p>
-    <w:p>
-      <w:pPr>
-        <w:jc w:val="center"/>
-        <w:rPr>
-          <w:rFonts w:cs="Times New Roman"/>
-        </w:rPr>
-      </w:pPr>
-      <w:r>
-        <w:rPr>
-          <w:rFonts w:cs="Times New Roman"/>
-        </w:rPr>
-        <w:t>Comunidad y Valoraciones: Ecosistema interactivo dentro de la plataforma</w:t>
-      </w:r>
-    </w:p>
-    <w:p>
-      <w:pPr>
-        <w:jc w:val="center"/>
-        <w:rPr>
-          <w:rFonts w:cs="Times New Roman"/>
-        </w:rPr>
-      </w:pPr>
-      <w:r>
-        <w:rPr>
-          <w:rFonts w:cs="Times New Roman"/>
-        </w:rPr>
-        <w:t>gastronómica donde los usuarios registrados comparten sus o</w:t>
-      </w:r>
-      <w:r>
-        <w:rPr>
-          <w:rFonts w:cs="Times New Roman"/>
-        </w:rPr>
-        <w:t xml:space="preserve">piniones, asignan puntuaciones, </w:t>
-      </w:r>
-      <w:r>
-        <w:rPr>
-          <w:rFonts w:cs="Times New Roman"/>
-        </w:rPr>
-        <w:t>guardan recetas y crean hábitos de convivencia digital.</w:t>
-      </w:r>
-    </w:p>
-    <w:p>
-      <w:pPr>
-        <w:jc w:val="center"/>
-        <w:rPr>
-          <w:rFonts w:cs="Times New Roman"/>
-        </w:rPr>
-      </w:pPr>
-      <w:r>
-        <w:rPr>
-          <w:rFonts w:cs="Times New Roman"/>
-        </w:rPr>
-        <w:t>Fidelización de Usuarios: Estrategia para fomentar la retención y frecuencia de uso</w:t>
-      </w:r>
-    </w:p>
-    <w:p>
-      <w:pPr>
-        <w:jc w:val="center"/>
-        <w:rPr>
-          <w:rFonts w:cs="Times New Roman"/>
-        </w:rPr>
-      </w:pPr>
-      <w:r>
-        <w:rPr>
-          <w:rFonts w:cs="Times New Roman"/>
-        </w:rPr>
-        <w:t>mediante la creación de espacios interactivos, pertenencia y generación de valor continuo.</w:t>
-      </w:r>
-    </w:p>
-    <w:p>
-      <w:pPr>
-        <w:jc w:val="center"/>
-        <w:rPr>
-          <w:rFonts w:cs="Times New Roman"/>
-        </w:rPr>
-      </w:pPr>
-      <w:r>
-        <w:rPr>
-          <w:rFonts w:cs="Times New Roman"/>
-        </w:rPr>
-        <w:lastRenderedPageBreak/>
-        <w:t>Prueba Social: Fenómeno psicológico y social donde los usuarios validan la calidad y</w:t>
-      </w:r>
-    </w:p>
-    <w:p>
-      <w:pPr>
-        <w:jc w:val="center"/>
-        <w:rPr>
-          <w:rFonts w:cs="Times New Roman"/>
-        </w:rPr>
-      </w:pPr>
-      <w:r>
-        <w:rPr>
-          <w:rFonts w:cs="Times New Roman"/>
-        </w:rPr>
-        <w:t>confiabilidad de una receta basándose en las experiencias, res</w:t>
-      </w:r>
-      <w:r>
-        <w:rPr>
-          <w:rFonts w:cs="Times New Roman"/>
-        </w:rPr>
-        <w:t xml:space="preserve">eñas y calificaciones otorgadas </w:t>
-      </w:r>
-      <w:r>
-        <w:rPr>
-          <w:rFonts w:cs="Times New Roman"/>
-        </w:rPr>
-        <w:t>previamente por otros cocineros.</w:t>
-      </w:r>
-    </w:p>
-    <w:p>
-      <w:pPr>
-        <w:jc w:val="center"/>
-        <w:rPr>
-          <w:rFonts w:cs="Times New Roman"/>
-        </w:rPr>
-      </w:pPr>
-      <w:r>
-        <w:rPr>
-          <w:rFonts w:cs="Times New Roman"/>
-        </w:rPr>
-        <w:t>Reporte de Contenido: Mecanismo mediante el cual los miembros de la comunidad</w:t>
-      </w:r>
-    </w:p>
-    <w:p>
-      <w:pPr>
-        <w:jc w:val="center"/>
-        <w:rPr>
-          <w:rFonts w:cs="Times New Roman"/>
-        </w:rPr>
-      </w:pPr>
-      <w:r>
-        <w:rPr>
-          <w:rFonts w:cs="Times New Roman"/>
-        </w:rPr>
-        <w:t>notifican a la plataforma sobre comentarios o publicaciones que incumplen las normas de</w:t>
-      </w:r>
-    </w:p>
-    <w:p>
-      <w:pPr>
-        <w:jc w:val="center"/>
-        <w:rPr>
-          <w:rFonts w:cs="Times New Roman"/>
-        </w:rPr>
-      </w:pPr>
-      <w:r>
-        <w:rPr>
-          <w:rFonts w:cs="Times New Roman"/>
-        </w:rPr>
-        <w:t>convivencia o afectan la calidad del recetario.</w:t>
-      </w:r>
-    </w:p>
-    <w:p>
-      <w:pPr>
-        <w:jc w:val="center"/>
-        <w:rPr>
-          <w:rFonts w:cs="Times New Roman"/>
-        </w:rPr>
-      </w:pPr>
-      <w:r>
-        <w:rPr>
-          <w:rFonts w:cs="Times New Roman"/>
-        </w:rPr>
-        <w:t>Reseña / Comentario Constructivo: Retroalimentación en texto que aporta valor</w:t>
-      </w:r>
-    </w:p>
-    <w:p>
-      <w:pPr>
-        <w:jc w:val="center"/>
-        <w:rPr>
-          <w:rFonts w:cs="Times New Roman"/>
-        </w:rPr>
-      </w:pPr>
-      <w:r>
-        <w:rPr>
-          <w:rFonts w:cs="Times New Roman"/>
-        </w:rPr>
-        <w:t>adicional a una receta, sugiriendo posibles sustituciones de ingredientes, variaciones de tiempo o</w:t>
-      </w:r>
-    </w:p>
-    <w:p>
-      <w:pPr>
-        <w:jc w:val="center"/>
-        <w:rPr>
-          <w:rFonts w:cs="Times New Roman"/>
-        </w:rPr>
-      </w:pPr>
-      <w:r>
-        <w:rPr>
-          <w:rFonts w:cs="Times New Roman"/>
-        </w:rPr>
-        <w:t>niveles reales de dificultad.</w:t>
-      </w:r>
-    </w:p>
-    <w:p>
-      <w:pPr>
-        <w:jc w:val="center"/>
-        <w:rPr>
-          <w:rFonts w:cs="Times New Roman"/>
-        </w:rPr>
-      </w:pPr>
-    </w:p>
-    <w:p>
-      <w:pPr>
-        <w:jc w:val="center"/>
-        <w:rPr>
-          <w:rFonts w:cs="Times New Roman"/>
-        </w:rPr>
-      </w:pPr>
-    </w:p>
-    <w:p>
-      <w:pPr>
-        <w:jc w:val="center"/>
-        <w:rPr>
-          <w:rFonts w:cs="Times New Roman"/>
-        </w:rPr>
-      </w:pPr>
-    </w:p>
-    <w:p>
-      <w:pPr>
-        <w:jc w:val="center"/>
-        <w:rPr>
-          <w:rFonts w:cs="Times New Roman"/>
-        </w:rPr>
-      </w:pPr>
-    </w:p>
-    <w:p>
-      <w:pPr>
-        <w:jc w:val="center"/>
-        <w:rPr>
-          <w:rFonts w:cs="Times New Roman"/>
-        </w:rPr>
-      </w:pPr>
-    </w:p>
-    <w:p>
-      <w:pPr>
-        <w:jc w:val="center"/>
-        <w:rPr>
-          <w:rFonts w:cs="Times New Roman"/>
-        </w:rPr>
-      </w:pPr>
-    </w:p>
-    <w:p>
-      <w:pPr>
-        <w:jc w:val="center"/>
-        <w:rPr>
-          <w:rFonts w:cs="Times New Roman"/>
-        </w:rPr>
-      </w:pPr>
-    </w:p>
-    <w:p>
-      <w:pPr>
-        <w:jc w:val="center"/>
-        <w:rPr>
-          <w:rFonts w:cs="Times New Roman"/>
-        </w:rPr>
-      </w:pPr>
-    </w:p>
-    <w:p>
-      <w:pPr>
-        <w:jc w:val="center"/>
-        <w:rPr>
-          <w:rFonts w:cs="Times New Roman"/>
-        </w:rPr>
-      </w:pPr>
-    </w:p>
-    <w:p>
-      <w:pPr>
-        <w:jc w:val="center"/>
-        <w:rPr>
-          <w:rFonts w:cs="Times New Roman"/>
-        </w:rPr>
-      </w:pPr>
-    </w:p>
-    <w:p>
-      <w:pPr>
-        <w:jc w:val="center"/>
-        <w:rPr>
-          <w:rFonts w:cs="Times New Roman"/>
-        </w:rPr>
-      </w:pPr>
-    </w:p>
-    <w:p>
-      <w:pPr>
-        <w:ind w:firstLine="0"/>
-        <w:rPr>
-          <w:rFonts w:cs="Times New Roman"/>
-        </w:rPr>
-      </w:pPr>
-    </w:p>
-    <w:p>
-      <w:pPr>
-        <w:jc w:val="center"/>
-        <w:rPr>
-          <w:rFonts w:cs="Times New Roman"/>
-        </w:rPr>
-      </w:pPr>
-      <w:r>
-        <w:rPr>
-          <w:rFonts w:cs="Times New Roman"/>
+          <w:lang w:val="en-US"/>
         </w:rPr>
         <w:lastRenderedPageBreak/>
         <w:t>Referencias</w:t>
       </w:r>
+      <w:bookmarkEnd w:id="19"/>
+      <w:proofErr w:type="spellEnd"/>
     </w:p>
     <w:p>
       <w:pPr>
         <w:jc w:val="center"/>
         <w:rPr>
           <w:rFonts w:cs="Times New Roman"/>
+          <w:lang w:val="en-US"/>
         </w:rPr>
       </w:pPr>
     </w:p>
@@ -4159,6 +4410,7 @@
         <w:jc w:val="center"/>
         <w:rPr>
           <w:rFonts w:cs="Times New Roman"/>
+          <w:lang w:val="en-US"/>
         </w:rPr>
       </w:pPr>
     </w:p>
@@ -4183,18 +4435,170 @@
         </w:rPr>
         <w:t xml:space="preserve">A Taxonomy for Learning, Teaching, and Assessing: A Revision of Bloom's Taxonomy of Educational Objectives. </w:t>
       </w:r>
+      <w:r>
+        <w:rPr>
+          <w:rFonts w:cs="Times New Roman"/>
+        </w:rPr>
+        <w:t>Longman.</w:t>
+      </w:r>
+    </w:p>
+    <w:p>
+      <w:pPr>
+        <w:ind w:firstLine="0"/>
+        <w:rPr>
+          <w:rFonts w:cs="Times New Roman"/>
+        </w:rPr>
+      </w:pPr>
+    </w:p>
+    <w:p>
+      <w:pPr>
+        <w:ind w:firstLine="0"/>
+        <w:rPr>
+          <w:rFonts w:cs="Times New Roman"/>
+        </w:rPr>
+      </w:pPr>
+      <w:r>
+        <w:rPr>
+          <w:rFonts w:cs="Times New Roman"/>
+        </w:rPr>
+        <w:t>taxonomía de Bloom utilizada en los objetivos.</w:t>
+      </w:r>
+    </w:p>
+    <w:p>
+      <w:pPr>
+        <w:ind w:firstLine="0"/>
+        <w:rPr>
+          <w:rFonts w:cs="Times New Roman"/>
+          <w:lang w:val="en-US"/>
+        </w:rPr>
+      </w:pPr>
+      <w:r>
+        <w:rPr>
+          <w:rFonts w:cs="Times New Roman"/>
+        </w:rPr>
+        <w:t xml:space="preserve">International </w:t>
+      </w:r>
       <w:proofErr w:type="spellStart"/>
       <w:r>
         <w:rPr>
           <w:rFonts w:cs="Times New Roman"/>
         </w:rPr>
-        <w:t>Longman</w:t>
+        <w:t>Organization</w:t>
       </w:r>
       <w:proofErr w:type="spellEnd"/>
       <w:r>
         <w:rPr>
           <w:rFonts w:cs="Times New Roman"/>
         </w:rPr>
+        <w:t xml:space="preserve"> </w:t>
+      </w:r>
+      <w:proofErr w:type="spellStart"/>
+      <w:r>
+        <w:rPr>
+          <w:rFonts w:cs="Times New Roman"/>
+        </w:rPr>
+        <w:t>for</w:t>
+      </w:r>
+      <w:proofErr w:type="spellEnd"/>
+      <w:r>
+        <w:rPr>
+          <w:rFonts w:cs="Times New Roman"/>
+        </w:rPr>
+        <w:t xml:space="preserve"> </w:t>
+      </w:r>
+      <w:proofErr w:type="spellStart"/>
+      <w:r>
+        <w:rPr>
+          <w:rFonts w:cs="Times New Roman"/>
+        </w:rPr>
+        <w:t>Standardization</w:t>
+      </w:r>
+      <w:proofErr w:type="spellEnd"/>
+      <w:r>
+        <w:rPr>
+          <w:rFonts w:cs="Times New Roman"/>
+        </w:rPr>
+        <w:t xml:space="preserve">. </w:t>
+      </w:r>
+      <w:r>
+        <w:rPr>
+          <w:rFonts w:cs="Times New Roman"/>
+          <w:lang w:val="en-US"/>
+        </w:rPr>
+        <w:t>(2018). ISO/IEC/IEEE 29148:2018: Systems and software engineering — Life cycle processes — Requirements engineering.</w:t>
+      </w:r>
+    </w:p>
+    <w:p>
+      <w:pPr>
+        <w:ind w:firstLine="0"/>
+        <w:rPr>
+          <w:rFonts w:cs="Times New Roman"/>
+          <w:lang w:val="en-US"/>
+        </w:rPr>
+      </w:pPr>
+    </w:p>
+    <w:p>
+      <w:pPr>
+        <w:ind w:firstLine="0"/>
+        <w:rPr>
+          <w:rFonts w:cs="Times New Roman"/>
+        </w:rPr>
+      </w:pPr>
+      <w:r>
+        <w:rPr>
+          <w:rFonts w:cs="Times New Roman"/>
+        </w:rPr>
+        <w:t>ingeniería de requisitos, incluyendo identificación, documentación y gestión de requisitos.</w:t>
+      </w:r>
+    </w:p>
+    <w:p>
+      <w:pPr>
+        <w:ind w:firstLine="0"/>
+        <w:rPr>
+          <w:rFonts w:cs="Times New Roman"/>
+          <w:lang w:val="en-US"/>
+        </w:rPr>
+      </w:pPr>
+      <w:r>
+        <w:rPr>
+          <w:rFonts w:cs="Times New Roman"/>
+          <w:lang w:val="en-US"/>
+        </w:rPr>
+        <w:t>Project Management Institute. (2021).</w:t>
+      </w:r>
+    </w:p>
+    <w:p>
+      <w:pPr>
+        <w:ind w:firstLine="0"/>
+        <w:rPr>
+          <w:rFonts w:cs="Times New Roman"/>
+        </w:rPr>
+      </w:pPr>
+      <w:r>
+        <w:rPr>
+          <w:rFonts w:cs="Times New Roman"/>
+          <w:lang w:val="en-US"/>
+        </w:rPr>
+        <w:t xml:space="preserve">A Guide to the Project Management Body of Knowledge (PMBOK® Guide) – Seventh Edition. </w:t>
+      </w:r>
+      <w:r>
+        <w:rPr>
+          <w:rFonts w:cs="Times New Roman"/>
+        </w:rPr>
+        <w:t xml:space="preserve">Project Management </w:t>
+      </w:r>
+      <w:proofErr w:type="spellStart"/>
+      <w:r>
+        <w:rPr>
+          <w:rFonts w:cs="Times New Roman"/>
+        </w:rPr>
+        <w:t>Institute</w:t>
+      </w:r>
+      <w:proofErr w:type="spellEnd"/>
+      <w:r>
+        <w:rPr>
+          <w:rFonts w:cs="Times New Roman"/>
+        </w:rPr>
         <w:t>.</w:t>
       </w:r>
     </w:p>
@@ -4217,7 +4621,7 @@
         <w:rPr>
           <w:rFonts w:cs="Times New Roman"/>
         </w:rPr>
-        <w:t>taxonomía de Bloom utilizada en los objetivos.</w:t>
+        <w:t>conceptos relacionados con alcance del proyecto.</w:t>
       </w:r>
     </w:p>
     <w:p>
@@ -4232,56 +4636,14 @@
         <w:rPr>
           <w:rFonts w:cs="Times New Roman"/>
         </w:rPr>
-        <w:t xml:space="preserve">International </w:t>
-      </w:r>
-      <w:proofErr w:type="spellStart"/>
-      <w:r>
-        <w:rPr>
-          <w:rFonts w:cs="Times New Roman"/>
-        </w:rPr>
-        <w:t>Organization</w:t>
-      </w:r>
-      <w:proofErr w:type="spellEnd"/>
-      <w:r>
-        <w:rPr>
-          <w:rFonts w:cs="Times New Roman"/>
-        </w:rPr>
-        <w:t xml:space="preserve"> </w:t>
-      </w:r>
-      <w:proofErr w:type="spellStart"/>
-      <w:r>
-        <w:rPr>
-          <w:rFonts w:cs="Times New Roman"/>
-        </w:rPr>
-        <w:t>for</w:t>
-      </w:r>
-      <w:proofErr w:type="spellEnd"/>
-      <w:r>
-        <w:rPr>
-          <w:rFonts w:cs="Times New Roman"/>
-        </w:rPr>
-        <w:t xml:space="preserve"> </w:t>
-      </w:r>
-      <w:proofErr w:type="spellStart"/>
-      <w:r>
-        <w:rPr>
-          <w:rFonts w:cs="Times New Roman"/>
-        </w:rPr>
-        <w:t>Standardization</w:t>
-      </w:r>
-      <w:proofErr w:type="spellEnd"/>
-      <w:r>
-        <w:rPr>
-          <w:rFonts w:cs="Times New Roman"/>
-        </w:rPr>
-        <w:t xml:space="preserve">. </w:t>
+        <w:t xml:space="preserve">Sommerville, I. (2016). </w:t>
       </w:r>
       <w:r>
         <w:rPr>
           <w:rFonts w:cs="Times New Roman"/>
           <w:lang w:val="en-US"/>
         </w:rPr>
-        <w:t>(2018). ISO/IEC/IEEE 29148:2018: Systems and software engineering — Life cycle processes — Requirements engineering.</w:t>
+        <w:t>Software Engineering (10th ed.). Pearson.</w:t>
       </w:r>
     </w:p>
     <w:p>
@@ -4298,14 +4660,9 @@
         <w:ind w:firstLine="0"/>
         <w:rPr>
           <w:rFonts w:cs="Times New Roman"/>
-        </w:rPr>
-      </w:pPr>
-      <w:r>
-        <w:rPr>
-          <w:rFonts w:cs="Times New Roman"/>
-        </w:rPr>
-        <w:t>ingeniería de requisitos, incluyendo identificación, documentación y gestión de requisitos.</w:t>
-      </w:r>
+          <w:lang w:val="en-US"/>
+        </w:rPr>
+      </w:pPr>
     </w:p>
     <w:p>
       <w:pPr>
@@ -4320,7 +4677,7 @@
           <w:rFonts w:cs="Times New Roman"/>
           <w:lang w:val="en-US"/>
         </w:rPr>
-        <w:t>Project Management Institute. (2021).</w:t>
+        <w:t>Bloom's Taxonomy - Cornell University</w:t>
       </w:r>
     </w:p>
     <w:p>
@@ -4328,34 +4685,15 @@
         <w:ind w:firstLine="0"/>
         <w:rPr>
           <w:rFonts w:cs="Times New Roman"/>
-        </w:rPr>
-      </w:pPr>
-      <w:r>
-        <w:rPr>
-          <w:rFonts w:cs="Times New Roman"/>
           <w:lang w:val="en-US"/>
         </w:rPr>
-        <w:t xml:space="preserve">A Guide to the Project Management Body of Knowledge (PMBOK® Guide) – Seventh Edition. </w:t>
-      </w:r>
-      <w:r>
-        <w:rPr>
-          <w:rFonts w:cs="Times New Roman"/>
-        </w:rPr>
-        <w:t xml:space="preserve">Project Management </w:t>
-      </w:r>
-      <w:proofErr w:type="spellStart"/>
-      <w:r>
-        <w:rPr>
-          <w:rFonts w:cs="Times New Roman"/>
-        </w:rPr>
-        <w:t>Institute</w:t>
-      </w:r>
-      <w:proofErr w:type="spellEnd"/>
-      <w:r>
-        <w:rPr>
-          <w:rFonts w:cs="Times New Roman"/>
-        </w:rPr>
-        <w:t>.</w:t>
+      </w:pPr>
+      <w:r>
+        <w:rPr>
+          <w:rFonts w:cs="Times New Roman"/>
+          <w:lang w:val="en-US"/>
+        </w:rPr>
+        <w:t>https://teaching.cornell.edu/resource/blooms-taxonomy?utm_source=chatgpt.com</w:t>
       </w:r>
     </w:p>
     <w:p>
@@ -4363,6 +4701,7 @@
         <w:ind w:firstLine="0"/>
         <w:rPr>
           <w:rFonts w:cs="Times New Roman"/>
+          <w:lang w:val="en-US"/>
         </w:rPr>
       </w:pPr>
     </w:p>
@@ -4371,14 +4710,9 @@
         <w:ind w:firstLine="0"/>
         <w:rPr>
           <w:rFonts w:cs="Times New Roman"/>
-        </w:rPr>
-      </w:pPr>
-      <w:r>
-        <w:rPr>
-          <w:rFonts w:cs="Times New Roman"/>
-        </w:rPr>
-        <w:t>conceptos relacionados con alcance del proyecto.</w:t>
-      </w:r>
+          <w:lang w:val="en-US"/>
+        </w:rPr>
+      </w:pPr>
     </w:p>
     <w:p>
       <w:pPr>
@@ -4388,26 +4722,13 @@
           <w:lang w:val="en-US"/>
         </w:rPr>
       </w:pPr>
-      <w:proofErr w:type="spellStart"/>
-      <w:r>
-        <w:rPr>
-          <w:rFonts w:cs="Times New Roman"/>
-        </w:rPr>
-        <w:t>Sommerville</w:t>
-      </w:r>
-      <w:proofErr w:type="spellEnd"/>
-      <w:r>
-        <w:rPr>
-          <w:rFonts w:cs="Times New Roman"/>
-        </w:rPr>
-        <w:t xml:space="preserve">, I. (2016). </w:t>
-      </w:r>
       <w:r>
         <w:rPr>
           <w:rFonts w:cs="Times New Roman"/>
           <w:lang w:val="en-US"/>
         </w:rPr>
-        <w:t>Software Engineering (10th ed.). Pearson.</w:t>
+        <w:lastRenderedPageBreak/>
+        <w:t>Libro de Anderson y Krathwohl (2001) - Library of Congress</w:t>
       </w:r>
     </w:p>
     <w:p>
@@ -4418,6 +4739,13 @@
           <w:lang w:val="en-US"/>
         </w:rPr>
       </w:pPr>
+      <w:r>
+        <w:rPr>
+          <w:rFonts w:cs="Times New Roman"/>
+          <w:lang w:val="en-US"/>
+        </w:rPr>
+        <w:t>https://www.loc.gov/item/00063423/?utm_source=chatgpt.com</w:t>
+      </w:r>
     </w:p>
     <w:p>
       <w:pPr>
@@ -4436,12 +4764,115 @@
           <w:lang w:val="en-US"/>
         </w:rPr>
       </w:pPr>
-      <w:r>
+    </w:p>
+    <w:p>
+      <w:pPr>
+        <w:ind w:firstLine="0"/>
+        <w:rPr>
+          <w:rFonts w:cs="Times New Roman"/>
+        </w:rPr>
+      </w:pPr>
+      <w:r>
+        <w:rPr>
+          <w:rFonts w:cs="Times New Roman"/>
+        </w:rPr>
+        <w:t>2. Ingeniería de requisitos</w:t>
+      </w:r>
+    </w:p>
+    <w:p>
+      <w:pPr>
+        <w:ind w:firstLine="0"/>
+        <w:rPr>
+          <w:rFonts w:cs="Times New Roman"/>
+        </w:rPr>
+      </w:pPr>
+      <w:r>
+        <w:rPr>
+          <w:rFonts w:cs="Times New Roman"/>
+        </w:rPr>
+        <w:t>ISO/IEC/IEEE 29148:2018 - ISO oficial</w:t>
+      </w:r>
+    </w:p>
+    <w:p>
+      <w:pPr>
+        <w:ind w:firstLine="0"/>
+        <w:rPr>
+          <w:rFonts w:cs="Times New Roman"/>
+        </w:rPr>
+      </w:pPr>
+      <w:r>
+        <w:rPr>
+          <w:rFonts w:cs="Times New Roman"/>
+        </w:rPr>
+        <w:t>https://www.iso.org/standard/72089.html?utm_source=chatgpt.com</w:t>
+      </w:r>
+    </w:p>
+    <w:p>
+      <w:pPr>
+        <w:ind w:firstLine="0"/>
+        <w:rPr>
+          <w:rFonts w:cs="Times New Roman"/>
+        </w:rPr>
+      </w:pPr>
+    </w:p>
+    <w:p>
+      <w:pPr>
+        <w:ind w:firstLine="0"/>
+        <w:rPr>
+          <w:rFonts w:cs="Times New Roman"/>
+        </w:rPr>
+      </w:pPr>
+    </w:p>
+    <w:p>
+      <w:pPr>
+        <w:ind w:firstLine="0"/>
+        <w:rPr>
+          <w:rFonts w:cs="Times New Roman"/>
+        </w:rPr>
+      </w:pPr>
+      <w:r>
+        <w:rPr>
+          <w:rFonts w:cs="Times New Roman"/>
+        </w:rPr>
+        <w:t>Vista previa ISO 29148</w:t>
+      </w:r>
+    </w:p>
+    <w:p>
+      <w:pPr>
+        <w:ind w:firstLine="0"/>
+        <w:rPr>
+          <w:rFonts w:cs="Times New Roman"/>
+        </w:rPr>
+      </w:pPr>
+      <w:r>
+        <w:rPr>
+          <w:rFonts w:cs="Times New Roman"/>
+        </w:rPr>
+        <w:t>https://www.iso.org/obp/ui?_escaped_fragment_=iso:std:iso-iec-ieee:29148:ed-2:v1:en&amp;utm_source=chatgpt.com</w:t>
+      </w:r>
+    </w:p>
+    <w:p>
+      <w:pPr>
+        <w:ind w:firstLine="0"/>
+        <w:rPr>
+          <w:rFonts w:cs="Times New Roman"/>
+        </w:rPr>
+      </w:pPr>
+    </w:p>
+    <w:p>
+      <w:pPr>
+        <w:ind w:firstLine="0"/>
         <w:rPr>
           <w:rFonts w:cs="Times New Roman"/>
           <w:lang w:val="en-US"/>
         </w:rPr>
-        <w:t>Bloom's Taxonomy - Cornell University</w:t>
+      </w:pPr>
+      <w:r>
+        <w:rPr>
+          <w:rFonts w:cs="Times New Roman"/>
+          <w:lang w:val="en-US"/>
+        </w:rPr>
+        <w:t>IEEE 29148:2018</w:t>
       </w:r>
     </w:p>
     <w:p>
@@ -4457,7 +4888,7 @@
           <w:rFonts w:cs="Times New Roman"/>
           <w:lang w:val="en-US"/>
         </w:rPr>
-        <w:t>https://teaching.cornell.edu/resource/blooms-taxonomy?utm_source=chatgpt.com</w:t>
+        <w:t>https://ieeexplore.ieee.org/document/8559686/amendments?signout=success&amp;utm_source=chatgpt.com#amendments</w:t>
       </w:r>
     </w:p>
     <w:p>
@@ -4468,6 +4899,13 @@
           <w:lang w:val="en-US"/>
         </w:rPr>
       </w:pPr>
+      <w:r>
+        <w:rPr>
+          <w:rFonts w:cs="Times New Roman"/>
+          <w:lang w:val="en-US"/>
+        </w:rPr>
+        <w:t>https://app.diagrams.net/</w:t>
+      </w:r>
     </w:p>
     <w:p>
       <w:pPr>
@@ -4486,652 +4924,213 @@
           <w:lang w:val="en-US"/>
         </w:rPr>
       </w:pPr>
-      <w:proofErr w:type="spellStart"/>
       <w:r>
         <w:rPr>
           <w:rFonts w:cs="Times New Roman"/>
           <w:lang w:val="en-US"/>
         </w:rPr>
-        <w:t>Libro</w:t>
-      </w:r>
-      <w:proofErr w:type="spellEnd"/>
-      <w:r>
+        <w:t>https://gemini.google.com/app/3a7c9b8c441955ac?hl=es</w:t>
+      </w:r>
+    </w:p>
+    <w:p>
+      <w:pPr>
+        <w:spacing w:after="160" w:line="278" w:lineRule="auto"/>
+        <w:ind w:firstLine="0"/>
         <w:rPr>
           <w:rFonts w:cs="Times New Roman"/>
           <w:lang w:val="en-US"/>
         </w:rPr>
-        <w:t xml:space="preserve"> de Anderson y </w:t>
-      </w:r>
-      <w:proofErr w:type="spellStart"/>
+      </w:pPr>
       <w:r>
         <w:rPr>
           <w:rFonts w:cs="Times New Roman"/>
           <w:lang w:val="en-US"/>
         </w:rPr>
-        <w:t>Krathwohl</w:t>
-      </w:r>
-      <w:proofErr w:type="spellEnd"/>
-      <w:r>
-        <w:rPr>
-          <w:rFonts w:cs="Times New Roman"/>
-          <w:lang w:val="en-US"/>
-        </w:rPr>
-        <w:t xml:space="preserve"> (2001) - Library of Congress</w:t>
-      </w:r>
-    </w:p>
-    <w:p>
-      <w:pPr>
+        <w:br w:type="page"/>
+      </w:r>
+    </w:p>
+    <w:p>
+      <w:pPr>
+        <w:pStyle w:val="Ttulo1"/>
+      </w:pPr>
+      <w:bookmarkStart w:id="20" w:name="_Toc242181771"/>
+      <w:r>
+        <w:lastRenderedPageBreak/>
+        <w:t>Reglamentación y Condiciones Legales</w:t>
+      </w:r>
+      <w:bookmarkEnd w:id="20"/>
+    </w:p>
+    <w:p>
+      <w:pPr>
+        <w:jc w:val="center"/>
+        <w:rPr>
+          <w:rFonts w:cs="Times New Roman"/>
+        </w:rPr>
+      </w:pPr>
+    </w:p>
+    <w:p>
+      <w:pPr>
+        <w:jc w:val="center"/>
+        <w:rPr>
+          <w:rFonts w:cs="Times New Roman"/>
+        </w:rPr>
+      </w:pPr>
+    </w:p>
+    <w:p>
+      <w:pPr>
+        <w:jc w:val="center"/>
+        <w:rPr>
+          <w:rFonts w:cs="Times New Roman"/>
+        </w:rPr>
+      </w:pPr>
+    </w:p>
+    <w:p>
+      <w:pPr>
+        <w:jc w:val="center"/>
+        <w:rPr>
+          <w:rFonts w:cs="Times New Roman"/>
+        </w:rPr>
+      </w:pPr>
+    </w:p>
+    <w:p>
+      <w:pPr>
+        <w:jc w:val="center"/>
+        <w:rPr>
+          <w:rFonts w:cs="Times New Roman"/>
+        </w:rPr>
+      </w:pPr>
+    </w:p>
+    <w:p>
+      <w:pPr>
+        <w:jc w:val="center"/>
+        <w:rPr>
+          <w:rFonts w:cs="Times New Roman"/>
+        </w:rPr>
+      </w:pPr>
+    </w:p>
+    <w:p>
+      <w:pPr>
+        <w:jc w:val="center"/>
+        <w:rPr>
+          <w:rFonts w:cs="Times New Roman"/>
+        </w:rPr>
+      </w:pPr>
+    </w:p>
+    <w:p>
+      <w:pPr>
+        <w:jc w:val="center"/>
+        <w:rPr>
+          <w:rFonts w:cs="Times New Roman"/>
+        </w:rPr>
+      </w:pPr>
+    </w:p>
+    <w:p>
+      <w:pPr>
+        <w:jc w:val="center"/>
+        <w:rPr>
+          <w:rFonts w:cs="Times New Roman"/>
+        </w:rPr>
+      </w:pPr>
+    </w:p>
+    <w:p>
+      <w:pPr>
+        <w:jc w:val="center"/>
+        <w:rPr>
+          <w:rFonts w:cs="Times New Roman"/>
+        </w:rPr>
+      </w:pPr>
+    </w:p>
+    <w:p>
+      <w:pPr>
+        <w:jc w:val="center"/>
+        <w:rPr>
+          <w:rFonts w:cs="Times New Roman"/>
+        </w:rPr>
+      </w:pPr>
+    </w:p>
+    <w:p>
+      <w:pPr>
+        <w:jc w:val="center"/>
+        <w:rPr>
+          <w:rFonts w:cs="Times New Roman"/>
+        </w:rPr>
+      </w:pPr>
+    </w:p>
+    <w:p>
+      <w:pPr>
+        <w:jc w:val="center"/>
+        <w:rPr>
+          <w:rFonts w:cs="Times New Roman"/>
+        </w:rPr>
+      </w:pPr>
+    </w:p>
+    <w:p>
+      <w:pPr>
+        <w:jc w:val="center"/>
+        <w:rPr>
+          <w:rFonts w:cs="Times New Roman"/>
+        </w:rPr>
+      </w:pPr>
+    </w:p>
+    <w:p>
+      <w:pPr>
+        <w:jc w:val="center"/>
+        <w:rPr>
+          <w:rFonts w:cs="Times New Roman"/>
+        </w:rPr>
+      </w:pPr>
+    </w:p>
+    <w:p>
+      <w:pPr>
+        <w:jc w:val="center"/>
+        <w:rPr>
+          <w:rFonts w:cs="Times New Roman"/>
+        </w:rPr>
+      </w:pPr>
+    </w:p>
+    <w:p>
+      <w:pPr>
+        <w:jc w:val="center"/>
+        <w:rPr>
+          <w:rFonts w:cs="Times New Roman"/>
+        </w:rPr>
+      </w:pPr>
+    </w:p>
+    <w:p>
+      <w:pPr>
+        <w:jc w:val="center"/>
+        <w:rPr>
+          <w:rFonts w:cs="Times New Roman"/>
+        </w:rPr>
+      </w:pPr>
+    </w:p>
+    <w:p>
+      <w:pPr>
+        <w:jc w:val="center"/>
+        <w:rPr>
+          <w:rFonts w:cs="Times New Roman"/>
+        </w:rPr>
+      </w:pPr>
+    </w:p>
+    <w:p>
+      <w:pPr>
+        <w:spacing w:after="160" w:line="278" w:lineRule="auto"/>
         <w:ind w:firstLine="0"/>
         <w:rPr>
           <w:rFonts w:cs="Times New Roman"/>
-          <w:lang w:val="en-US"/>
-        </w:rPr>
-      </w:pPr>
-      <w:r>
-        <w:rPr>
-          <w:rFonts w:cs="Times New Roman"/>
-          <w:lang w:val="en-US"/>
-        </w:rPr>
-        <w:lastRenderedPageBreak/>
-        <w:t>https://www.loc.gov/item/00063423/?utm_source=chatgpt.com</w:t>
-      </w:r>
-    </w:p>
-    <w:p>
-      <w:pPr>
+        </w:rPr>
+      </w:pPr>
+      <w:r>
+        <w:rPr>
+          <w:rFonts w:cs="Times New Roman"/>
+        </w:rPr>
+        <w:br w:type="page"/>
+      </w:r>
+    </w:p>
+    <w:p>
+      <w:pPr>
+        <w:spacing w:after="160" w:line="278" w:lineRule="auto"/>
         <w:ind w:firstLine="0"/>
-        <w:rPr>
-          <w:rFonts w:cs="Times New Roman"/>
-          <w:lang w:val="en-US"/>
-        </w:rPr>
-      </w:pPr>
-    </w:p>
-    <w:p>
-      <w:pPr>
-        <w:ind w:firstLine="0"/>
-        <w:rPr>
-          <w:rFonts w:cs="Times New Roman"/>
-          <w:lang w:val="en-US"/>
-        </w:rPr>
-      </w:pPr>
-    </w:p>
-    <w:p>
-      <w:pPr>
-        <w:ind w:firstLine="0"/>
-        <w:rPr>
-          <w:rFonts w:cs="Times New Roman"/>
-        </w:rPr>
-      </w:pPr>
-      <w:r>
-        <w:rPr>
-          <w:rFonts w:cs="Times New Roman"/>
-        </w:rPr>
-        <w:t>2. Ingeniería de requisitos</w:t>
-      </w:r>
-    </w:p>
-    <w:p>
-      <w:pPr>
-        <w:ind w:firstLine="0"/>
-        <w:rPr>
-          <w:rFonts w:cs="Times New Roman"/>
-        </w:rPr>
-      </w:pPr>
-      <w:r>
-        <w:rPr>
-          <w:rFonts w:cs="Times New Roman"/>
-        </w:rPr>
-        <w:t>ISO/IEC/IEEE 29148:2018 - ISO oficial</w:t>
-      </w:r>
-    </w:p>
-    <w:p>
-      <w:pPr>
-        <w:ind w:firstLine="0"/>
-        <w:rPr>
-          <w:rFonts w:cs="Times New Roman"/>
-        </w:rPr>
-      </w:pPr>
-      <w:r>
-        <w:rPr>
-          <w:rFonts w:cs="Times New Roman"/>
-        </w:rPr>
-        <w:t>https://www.iso.org/standard/72089.html?utm_source=chatgpt.com</w:t>
-      </w:r>
-    </w:p>
-    <w:p>
-      <w:pPr>
-        <w:ind w:firstLine="0"/>
-        <w:rPr>
-          <w:rFonts w:cs="Times New Roman"/>
-        </w:rPr>
-      </w:pPr>
-    </w:p>
-    <w:p>
-      <w:pPr>
-        <w:ind w:firstLine="0"/>
-        <w:rPr>
-          <w:rFonts w:cs="Times New Roman"/>
-        </w:rPr>
-      </w:pPr>
-    </w:p>
-    <w:p>
-      <w:pPr>
-        <w:ind w:firstLine="0"/>
-        <w:rPr>
-          <w:rFonts w:cs="Times New Roman"/>
-        </w:rPr>
-      </w:pPr>
-      <w:r>
-        <w:rPr>
-          <w:rFonts w:cs="Times New Roman"/>
-        </w:rPr>
-        <w:t>Vista previa ISO 29148</w:t>
-      </w:r>
-    </w:p>
-    <w:p>
-      <w:pPr>
-        <w:ind w:firstLine="0"/>
-        <w:rPr>
-          <w:rFonts w:cs="Times New Roman"/>
-        </w:rPr>
-      </w:pPr>
-      <w:r>
-        <w:rPr>
-          <w:rFonts w:cs="Times New Roman"/>
-        </w:rPr>
-        <w:t>https://www.iso.org/obp/ui?_escaped_fragment_=iso:std:iso-iec-ieee:29148:ed-2:v1:en&amp;utm_source=chatgpt.com</w:t>
-      </w:r>
-    </w:p>
-    <w:p>
-      <w:pPr>
-        <w:ind w:firstLine="0"/>
-        <w:rPr>
-          <w:rFonts w:cs="Times New Roman"/>
-        </w:rPr>
-      </w:pPr>
-    </w:p>
-    <w:p>
-      <w:pPr>
-        <w:ind w:firstLine="0"/>
-        <w:rPr>
-          <w:rFonts w:cs="Times New Roman"/>
-          <w:lang w:val="en-US"/>
-        </w:rPr>
-      </w:pPr>
-      <w:r>
-        <w:rPr>
-          <w:rFonts w:cs="Times New Roman"/>
-          <w:lang w:val="en-US"/>
-        </w:rPr>
-        <w:t>IEEE 29148:2018</w:t>
-      </w:r>
-    </w:p>
-    <w:p>
-      <w:pPr>
-        <w:ind w:firstLine="0"/>
-        <w:rPr>
-          <w:rFonts w:cs="Times New Roman"/>
-          <w:lang w:val="en-US"/>
-        </w:rPr>
-      </w:pPr>
-      <w:r>
-        <w:rPr>
-          <w:rFonts w:cs="Times New Roman"/>
-          <w:lang w:val="en-US"/>
-        </w:rPr>
-        <w:t>https://ieeexplore.ieee.org/document/8559686/amendments?signout=success&amp;utm_source=chatgpt.com#amendments</w:t>
-      </w:r>
-    </w:p>
-    <w:p>
-      <w:pPr>
-        <w:ind w:firstLine="0"/>
-        <w:rPr>
-          <w:rFonts w:cs="Times New Roman"/>
-          <w:lang w:val="en-US"/>
-        </w:rPr>
-      </w:pPr>
-      <w:r>
-        <w:rPr>
-          <w:rFonts w:cs="Times New Roman"/>
-          <w:lang w:val="en-US"/>
-        </w:rPr>
-        <w:t>https://app.diagrams.net/</w:t>
-      </w:r>
-    </w:p>
-    <w:p>
-      <w:pPr>
-        <w:ind w:firstLine="0"/>
-        <w:rPr>
-          <w:rFonts w:cs="Times New Roman"/>
-          <w:lang w:val="en-US"/>
-        </w:rPr>
-      </w:pPr>
-    </w:p>
-    <w:p>
-      <w:pPr>
-        <w:ind w:firstLine="0"/>
-        <w:rPr>
-          <w:rFonts w:cs="Times New Roman"/>
-          <w:lang w:val="en-US"/>
-        </w:rPr>
-      </w:pPr>
-      <w:r>
-        <w:rPr>
-          <w:rFonts w:cs="Times New Roman"/>
-          <w:lang w:val="en-US"/>
-        </w:rPr>
-        <w:t>https://gemini.google.com/app/3a7c9b8c441955ac?hl=es</w:t>
-      </w:r>
-      <w:bookmarkStart w:id="16" w:name="_GoBack"/>
-      <w:bookmarkEnd w:id="16"/>
-    </w:p>
-    <w:p>
-      <w:pPr>
-        <w:jc w:val="center"/>
-        <w:rPr>
-          <w:rFonts w:cs="Times New Roman"/>
-          <w:lang w:val="en-US"/>
-        </w:rPr>
-      </w:pPr>
-    </w:p>
-    <w:p>
-      <w:pPr>
-        <w:jc w:val="center"/>
-        <w:rPr>
-          <w:rFonts w:cs="Times New Roman"/>
-          <w:lang w:val="en-US"/>
-        </w:rPr>
-      </w:pPr>
-    </w:p>
-    <w:p>
-      <w:pPr>
-        <w:jc w:val="center"/>
-        <w:rPr>
-          <w:rFonts w:cs="Times New Roman"/>
-          <w:lang w:val="en-US"/>
-        </w:rPr>
-      </w:pPr>
-    </w:p>
-    <w:p>
-      <w:pPr>
-        <w:jc w:val="center"/>
-        <w:rPr>
-          <w:rFonts w:cs="Times New Roman"/>
-          <w:lang w:val="en-US"/>
-        </w:rPr>
-      </w:pPr>
-    </w:p>
-    <w:p>
-      <w:pPr>
-        <w:jc w:val="center"/>
-        <w:rPr>
-          <w:rFonts w:cs="Times New Roman"/>
-          <w:lang w:val="en-US"/>
-        </w:rPr>
-      </w:pPr>
-    </w:p>
-    <w:p>
-      <w:pPr>
-        <w:jc w:val="center"/>
-        <w:rPr>
-          <w:rFonts w:cs="Times New Roman"/>
-          <w:lang w:val="en-US"/>
-        </w:rPr>
-      </w:pPr>
-    </w:p>
-    <w:p>
-      <w:pPr>
-        <w:jc w:val="center"/>
-        <w:rPr>
-          <w:rFonts w:cs="Times New Roman"/>
-          <w:lang w:val="en-US"/>
-        </w:rPr>
-      </w:pPr>
-    </w:p>
-    <w:p>
-      <w:pPr>
-        <w:jc w:val="center"/>
-        <w:rPr>
-          <w:rFonts w:cs="Times New Roman"/>
-          <w:lang w:val="en-US"/>
-        </w:rPr>
-      </w:pPr>
-    </w:p>
-    <w:p>
-      <w:pPr>
-        <w:jc w:val="center"/>
-        <w:rPr>
-          <w:rFonts w:cs="Times New Roman"/>
-          <w:lang w:val="en-US"/>
-        </w:rPr>
-      </w:pPr>
-    </w:p>
-    <w:p>
-      <w:pPr>
-        <w:jc w:val="center"/>
-        <w:rPr>
-          <w:rFonts w:cs="Times New Roman"/>
-          <w:lang w:val="en-US"/>
-        </w:rPr>
-      </w:pPr>
-    </w:p>
-    <w:p>
-      <w:pPr>
-        <w:jc w:val="center"/>
-        <w:rPr>
-          <w:rFonts w:cs="Times New Roman"/>
-          <w:lang w:val="en-US"/>
-        </w:rPr>
-      </w:pPr>
-    </w:p>
-    <w:p>
-      <w:pPr>
-        <w:jc w:val="center"/>
-        <w:rPr>
-          <w:rFonts w:cs="Times New Roman"/>
-          <w:lang w:val="en-US"/>
-        </w:rPr>
-      </w:pPr>
-    </w:p>
-    <w:p>
-      <w:pPr>
-        <w:jc w:val="center"/>
-        <w:rPr>
-          <w:rFonts w:cs="Times New Roman"/>
-          <w:lang w:val="en-US"/>
-        </w:rPr>
-      </w:pPr>
-    </w:p>
-    <w:p>
-      <w:pPr>
-        <w:jc w:val="center"/>
-        <w:rPr>
-          <w:rFonts w:cs="Times New Roman"/>
-          <w:lang w:val="en-US"/>
-        </w:rPr>
-      </w:pPr>
-    </w:p>
-    <w:p>
-      <w:pPr>
-        <w:jc w:val="center"/>
-        <w:rPr>
-          <w:rFonts w:cs="Times New Roman"/>
-          <w:lang w:val="en-US"/>
-        </w:rPr>
-      </w:pPr>
-    </w:p>
-    <w:p>
-      <w:pPr>
-        <w:jc w:val="center"/>
-        <w:rPr>
-          <w:rFonts w:cs="Times New Roman"/>
-          <w:lang w:val="en-US"/>
-        </w:rPr>
-      </w:pPr>
-    </w:p>
-    <w:p>
-      <w:pPr>
-        <w:jc w:val="center"/>
-        <w:rPr>
-          <w:rFonts w:cs="Times New Roman"/>
-          <w:lang w:val="en-US"/>
-        </w:rPr>
-      </w:pPr>
-    </w:p>
-    <w:p>
-      <w:pPr>
-        <w:jc w:val="center"/>
-        <w:rPr>
-          <w:rFonts w:cs="Times New Roman"/>
-          <w:lang w:val="en-US"/>
-        </w:rPr>
-      </w:pPr>
-    </w:p>
-    <w:p>
-      <w:pPr>
-        <w:jc w:val="center"/>
-        <w:rPr>
-          <w:rFonts w:cs="Times New Roman"/>
-          <w:lang w:val="en-US"/>
-        </w:rPr>
-      </w:pPr>
-    </w:p>
-    <w:p>
-      <w:pPr>
-        <w:jc w:val="center"/>
-        <w:rPr>
-          <w:rFonts w:cs="Times New Roman"/>
-          <w:lang w:val="en-US"/>
-        </w:rPr>
-      </w:pPr>
-    </w:p>
-    <w:p>
-      <w:pPr>
-        <w:jc w:val="center"/>
-        <w:rPr>
-          <w:rFonts w:cs="Times New Roman"/>
-          <w:lang w:val="en-US"/>
-        </w:rPr>
-      </w:pPr>
-    </w:p>
-    <w:p>
-      <w:pPr>
-        <w:jc w:val="center"/>
-        <w:rPr>
-          <w:rFonts w:cs="Times New Roman"/>
-          <w:lang w:val="en-US"/>
-        </w:rPr>
-      </w:pPr>
-    </w:p>
-    <w:p>
-      <w:pPr>
-        <w:jc w:val="center"/>
-        <w:rPr>
-          <w:rFonts w:cs="Times New Roman"/>
-          <w:lang w:val="en-US"/>
-        </w:rPr>
-      </w:pPr>
-    </w:p>
-    <w:p>
-      <w:pPr>
-        <w:jc w:val="center"/>
-        <w:rPr>
-          <w:rFonts w:cs="Times New Roman"/>
-          <w:lang w:val="en-US"/>
-        </w:rPr>
-      </w:pPr>
-    </w:p>
-    <w:p>
-      <w:pPr>
-        <w:jc w:val="center"/>
-        <w:rPr>
-          <w:rFonts w:cs="Times New Roman"/>
-        </w:rPr>
-      </w:pPr>
-      <w:r>
-        <w:rPr>
-          <w:rFonts w:cs="Times New Roman"/>
-        </w:rPr>
-        <w:t>Reglamentación y Condiciones Legales</w:t>
-      </w:r>
-    </w:p>
-    <w:p>
-      <w:pPr>
-        <w:jc w:val="center"/>
-        <w:rPr>
-          <w:rFonts w:cs="Times New Roman"/>
-        </w:rPr>
-      </w:pPr>
-    </w:p>
-    <w:p>
-      <w:pPr>
-        <w:jc w:val="center"/>
-        <w:rPr>
-          <w:rFonts w:cs="Times New Roman"/>
-        </w:rPr>
-      </w:pPr>
-    </w:p>
-    <w:p>
-      <w:pPr>
-        <w:jc w:val="center"/>
-        <w:rPr>
-          <w:rFonts w:cs="Times New Roman"/>
-        </w:rPr>
-      </w:pPr>
-    </w:p>
-    <w:p>
-      <w:pPr>
-        <w:jc w:val="center"/>
-        <w:rPr>
-          <w:rFonts w:cs="Times New Roman"/>
-        </w:rPr>
-      </w:pPr>
-    </w:p>
-    <w:p>
-      <w:pPr>
-        <w:jc w:val="center"/>
-        <w:rPr>
-          <w:rFonts w:cs="Times New Roman"/>
-        </w:rPr>
-      </w:pPr>
-    </w:p>
-    <w:p>
-      <w:pPr>
-        <w:jc w:val="center"/>
-        <w:rPr>
-          <w:rFonts w:cs="Times New Roman"/>
-        </w:rPr>
-      </w:pPr>
-    </w:p>
-    <w:p>
-      <w:pPr>
-        <w:jc w:val="center"/>
-        <w:rPr>
-          <w:rFonts w:cs="Times New Roman"/>
-        </w:rPr>
-      </w:pPr>
-    </w:p>
-    <w:p>
-      <w:pPr>
-        <w:jc w:val="center"/>
-        <w:rPr>
-          <w:rFonts w:cs="Times New Roman"/>
-        </w:rPr>
-      </w:pPr>
-    </w:p>
-    <w:p>
-      <w:pPr>
-        <w:jc w:val="center"/>
-        <w:rPr>
-          <w:rFonts w:cs="Times New Roman"/>
-        </w:rPr>
-      </w:pPr>
-    </w:p>
-    <w:p>
-      <w:pPr>
-        <w:jc w:val="center"/>
-        <w:rPr>
-          <w:rFonts w:cs="Times New Roman"/>
-        </w:rPr>
-      </w:pPr>
-    </w:p>
-    <w:p>
-      <w:pPr>
-        <w:jc w:val="center"/>
-        <w:rPr>
-          <w:rFonts w:cs="Times New Roman"/>
-        </w:rPr>
-      </w:pPr>
-    </w:p>
-    <w:p>
-      <w:pPr>
-        <w:jc w:val="center"/>
-        <w:rPr>
-          <w:rFonts w:cs="Times New Roman"/>
-        </w:rPr>
-      </w:pPr>
-    </w:p>
-    <w:p>
-      <w:pPr>
-        <w:jc w:val="center"/>
-        <w:rPr>
-          <w:rFonts w:cs="Times New Roman"/>
-        </w:rPr>
-      </w:pPr>
-    </w:p>
-    <w:p>
-      <w:pPr>
-        <w:jc w:val="center"/>
-        <w:rPr>
-          <w:rFonts w:cs="Times New Roman"/>
-        </w:rPr>
-      </w:pPr>
-    </w:p>
-    <w:p>
-      <w:pPr>
-        <w:jc w:val="center"/>
-        <w:rPr>
-          <w:rFonts w:cs="Times New Roman"/>
-        </w:rPr>
-      </w:pPr>
-    </w:p>
-    <w:p>
-      <w:pPr>
-        <w:jc w:val="center"/>
-        <w:rPr>
-          <w:rFonts w:cs="Times New Roman"/>
-        </w:rPr>
-      </w:pPr>
-    </w:p>
-    <w:p>
-      <w:pPr>
-        <w:jc w:val="center"/>
-        <w:rPr>
-          <w:rFonts w:cs="Times New Roman"/>
-        </w:rPr>
-      </w:pPr>
-    </w:p>
-    <w:p>
-      <w:pPr>
-        <w:jc w:val="center"/>
-        <w:rPr>
-          <w:rFonts w:cs="Times New Roman"/>
-        </w:rPr>
-      </w:pPr>
-    </w:p>
-    <w:p>
-      <w:pPr>
-        <w:jc w:val="center"/>
-        <w:rPr>
-          <w:rFonts w:cs="Times New Roman"/>
-        </w:rPr>
-      </w:pPr>
-    </w:p>
-    <w:p>
-      <w:pPr>
-        <w:jc w:val="center"/>
-        <w:rPr>
-          <w:rFonts w:cs="Times New Roman"/>
-        </w:rPr>
-      </w:pPr>
-    </w:p>
-    <w:p>
-      <w:pPr>
-        <w:jc w:val="center"/>
-        <w:rPr>
-          <w:rFonts w:cs="Times New Roman"/>
-        </w:rPr>
-      </w:pPr>
-    </w:p>
-    <w:p>
-      <w:pPr>
-        <w:jc w:val="center"/>
-        <w:rPr>
-          <w:rFonts w:cs="Times New Roman"/>
-        </w:rPr>
-      </w:pPr>
-    </w:p>
-    <w:p>
-      <w:pPr>
-        <w:jc w:val="center"/>
         <w:rPr>
           <w:rFonts w:cs="Times New Roman"/>
         </w:rPr>
@@ -5148,7 +5147,7 @@
 </file>
 
 <file path=word/numbering.xml><?xml version="1.0" encoding="utf-8"?>
-<w:numbering xmlns:wpc="http://schemas.microsoft.com/office/word/2010/wordprocessingCanvas" xmlns:cx="http://schemas.microsoft.com/office/drawing/2014/chartex" xmlns:mc="http://schemas.openxmlformats.org/markup-compatibility/2006" xmlns:o="urn:schemas-microsoft-com:office:office" xmlns:r="http://schemas.openxmlformats.org/officeDocument/2006/relationships" xmlns:m="http://schemas.openxmlformats.org/officeDocument/2006/math" xmlns:v="urn:schemas-microsoft-com:vml" xmlns:wp14="http://schemas.microsoft.com/office/word/2010/wordprocessingDrawing" xmlns:wp="http://schemas.openxmlformats.org/drawingml/2006/wordprocessingDrawing" xmlns:w10="urn:schemas-microsoft-com:office:word" xmlns:w="http://schemas.openxmlformats.org/wordprocessingml/2006/main" xmlns:w14="http://schemas.microsoft.com/office/word/2010/wordml" xmlns:w15="http://schemas.microsoft.com/office/word/2012/wordml" xmlns:w16se="http://schemas.microsoft.com/office/word/2015/wordml/symex" xmlns:wpg="http://schemas.microsoft.com/office/word/2010/wordprocessingGroup" xmlns:wpi="http://schemas.microsoft.com/office/word/2010/wordprocessingInk" xmlns:wne="http://schemas.microsoft.com/office/word/2006/wordml" xmlns:wps="http://schemas.microsoft.com/office/word/2010/wordprocessingShape" mc:Ignorable="w14 w15 w16se wp14">
+<w:numbering xmlns:wpc="http://schemas.microsoft.com/office/word/2010/wordprocessingCanvas" xmlns:cx="http://schemas.microsoft.com/office/drawing/2014/chartex" xmlns:cx1="http://schemas.microsoft.com/office/drawing/2015/9/8/chartex" xmlns:cx2="http://schemas.microsoft.com/office/drawing/2015/10/21/chartex" xmlns:cx3="http://schemas.microsoft.com/office/drawing/2016/5/9/chartex" xmlns:cx4="http://schemas.microsoft.com/office/drawing/2016/5/10/chartex" xmlns:cx5="http://schemas.microsoft.com/office/drawing/2016/5/11/chartex" xmlns:cx6="http://schemas.microsoft.com/office/drawing/2016/5/12/chartex" xmlns:cx7="http://schemas.microsoft.com/office/drawing/2016/5/13/chartex" xmlns:cx8="http://schemas.microsoft.com/office/drawing/2016/5/14/chartex" xmlns:mc="http://schemas.openxmlformats.org/markup-compatibility/2006" xmlns:aink="http://schemas.microsoft.com/office/drawing/2016/ink" xmlns:am3d="http://schemas.microsoft.com/office/drawing/2017/model3d" xmlns:o="urn:schemas-microsoft-com:office:office" xmlns:oel="http://schemas.microsoft.com/office/2019/extlst" xmlns:r="http://schemas.openxmlformats.org/officeDocument/2006/relationships" xmlns:m="http://schemas.openxmlformats.org/officeDocument/2006/math" xmlns:v="urn:schemas-microsoft-com:vml" xmlns:wp14="http://schemas.microsoft.com/office/word/2010/wordprocessingDrawing" xmlns:wp="http://schemas.openxmlformats.org/drawingml/2006/wordprocessingDrawing" xmlns:w10="urn:schemas-microsoft-com:office:word" xmlns:w="http://schemas.openxmlformats.org/wordprocessingml/2006/main" xmlns:w14="http://schemas.microsoft.com/office/word/2010/wordml" xmlns:w15="http://schemas.microsoft.com/office/word/2012/wordml" xmlns:w16cex="http://schemas.microsoft.com/office/word/2018/wordml/cex" xmlns:w16cid="http://schemas.microsoft.com/office/word/2016/wordml/cid" xmlns:w16="http://schemas.microsoft.com/office/word/2018/wordml" xmlns:w16du="http://schemas.microsoft.com/office/word/2023/wordml/word16du" xmlns:w16sdtdh="http://schemas.microsoft.com/office/word/2020/wordml/sdtdatahash" xmlns:w16se="http://schemas.microsoft.com/office/word/2015/wordml/symex" xmlns:wpg="http://schemas.microsoft.com/office/word/2010/wordprocessingGroup" xmlns:wpi="http://schemas.microsoft.com/office/word/2010/wordprocessingInk" xmlns:wne="http://schemas.microsoft.com/office/word/2006/wordml" xmlns:wps="http://schemas.microsoft.com/office/word/2010/wordprocessingShape" mc:Ignorable="w14 w15 w16se w16cid w16 w16cex w16sdtdh w16du wp14">
   <w:abstractNum w:abstractNumId="0" w15:restartNumberingAfterBreak="0">
     <w:nsid w:val="FFFFFF89"/>
     <w:multiLevelType w:val="singleLevel"/>
@@ -6040,35 +6039,35 @@
       </w:rPr>
     </w:lvl>
   </w:abstractNum>
-  <w:num w:numId="1">
+  <w:num w:numId="1" w16cid:durableId="1632781976">
     <w:abstractNumId w:val="4"/>
   </w:num>
-  <w:num w:numId="2">
+  <w:num w:numId="2" w16cid:durableId="1628000654">
     <w:abstractNumId w:val="2"/>
   </w:num>
-  <w:num w:numId="3">
+  <w:num w:numId="3" w16cid:durableId="916667261">
     <w:abstractNumId w:val="1"/>
   </w:num>
-  <w:num w:numId="4">
+  <w:num w:numId="4" w16cid:durableId="1885873786">
     <w:abstractNumId w:val="3"/>
   </w:num>
-  <w:num w:numId="5">
+  <w:num w:numId="5" w16cid:durableId="1290239184">
     <w:abstractNumId w:val="5"/>
   </w:num>
-  <w:num w:numId="6">
+  <w:num w:numId="6" w16cid:durableId="1085105553">
     <w:abstractNumId w:val="7"/>
   </w:num>
-  <w:num w:numId="7">
+  <w:num w:numId="7" w16cid:durableId="1248198984">
     <w:abstractNumId w:val="6"/>
   </w:num>
-  <w:num w:numId="8">
+  <w:num w:numId="8" w16cid:durableId="37554890">
     <w:abstractNumId w:val="0"/>
   </w:num>
 </w:numbering>
 </file>
 
 <file path=word/styles.xml><?xml version="1.0" encoding="utf-8"?>
-<w:styles xmlns:mc="http://schemas.openxmlformats.org/markup-compatibility/2006" xmlns:r="http://schemas.openxmlformats.org/officeDocument/2006/relationships" xmlns:w="http://schemas.openxmlformats.org/wordprocessingml/2006/main" xmlns:w14="http://schemas.microsoft.com/office/word/2010/wordml" xmlns:w15="http://schemas.microsoft.com/office/word/2012/wordml" xmlns:w16se="http://schemas.microsoft.com/office/word/2015/wordml/symex" mc:Ignorable="w14 w15 w16se">
+<w:styles xmlns:mc="http://schemas.openxmlformats.org/markup-compatibility/2006" xmlns:r="http://schemas.openxmlformats.org/officeDocument/2006/relationships" xmlns:w="http://schemas.openxmlformats.org/wordprocessingml/2006/main" xmlns:w14="http://schemas.microsoft.com/office/word/2010/wordml" xmlns:w15="http://schemas.microsoft.com/office/word/2012/wordml" xmlns:w16cex="http://schemas.microsoft.com/office/word/2018/wordml/cex" xmlns:w16cid="http://schemas.microsoft.com/office/word/2016/wordml/cid" xmlns:w16="http://schemas.microsoft.com/office/word/2018/wordml" xmlns:w16du="http://schemas.microsoft.com/office/word/2023/wordml/word16du" xmlns:w16sdtdh="http://schemas.microsoft.com/office/word/2020/wordml/sdtdatahash" xmlns:w16se="http://schemas.microsoft.com/office/word/2015/wordml/symex" mc:Ignorable="w14 w15 w16se w16cid w16 w16cex w16sdtdh w16du">
   <w:docDefaults>
     <w:rPrDefault>
       <w:rPr>
@@ -6086,7 +6085,7 @@
       </w:pPr>
     </w:pPrDefault>
   </w:docDefaults>
-  <w:latentStyles w:defLockedState="0" w:defUIPriority="99" w:defSemiHidden="0" w:defUnhideWhenUsed="0" w:defQFormat="0" w:count="371">
+  <w:latentStyles w:defLockedState="0" w:defUIPriority="99" w:defSemiHidden="0" w:defUnhideWhenUsed="0" w:defQFormat="0" w:count="376">
     <w:lsdException w:name="Normal" w:uiPriority="0" w:qFormat="1"/>
     <w:lsdException w:name="heading 1" w:uiPriority="9" w:qFormat="1"/>
     <w:lsdException w:name="heading 2" w:semiHidden="1" w:uiPriority="9" w:unhideWhenUsed="1" w:qFormat="1"/>
@@ -6458,6 +6457,11 @@
     <w:lsdException w:name="List Table 5 Dark Accent 6" w:uiPriority="50"/>
     <w:lsdException w:name="List Table 6 Colorful Accent 6" w:uiPriority="51"/>
     <w:lsdException w:name="List Table 7 Colorful Accent 6" w:uiPriority="52"/>
+    <w:lsdException w:name="Mention" w:semiHidden="1" w:unhideWhenUsed="1"/>
+    <w:lsdException w:name="Smart Hyperlink" w:semiHidden="1" w:unhideWhenUsed="1"/>
+    <w:lsdException w:name="Hashtag" w:semiHidden="1" w:unhideWhenUsed="1"/>
+    <w:lsdException w:name="Unresolved Mention" w:semiHidden="1" w:unhideWhenUsed="1"/>
+    <w:lsdException w:name="Smart Link" w:semiHidden="1" w:unhideWhenUsed="1"/>
   </w:latentStyles>
   <w:style w:type="paragraph" w:default="1" w:styleId="Normal">
     <w:name w:val="Normal"/>
@@ -7206,6 +7210,45 @@
       <w14:ligatures w14:val="none"/>
     </w:rPr>
   </w:style>
+  <w:style w:type="character" w:styleId="Textoennegrita">
+    <w:name w:val="Strong"/>
+    <w:basedOn w:val="Fuentedeprrafopredeter"/>
+    <w:uiPriority w:val="22"/>
+    <w:qFormat/>
+    <w:rsid w:val="00C00099"/>
+    <w:rPr>
+      <w:b/>
+      <w:bCs/>
+    </w:rPr>
+  </w:style>
+  <w:style w:type="table" w:customStyle="1" w:styleId="APA">
+    <w:name w:val="APA"/>
+    <w:basedOn w:val="Tablanormal"/>
+    <w:uiPriority w:val="99"/>
+    <w:rsid w:val="00C00099"/>
+    <w:pPr>
+      <w:spacing w:after="0" w:line="240" w:lineRule="auto"/>
+    </w:pPr>
+    <w:tblPr>
+      <w:tblBorders>
+        <w:top w:val="single" w:sz="4" w:space="0" w:color="auto"/>
+        <w:bottom w:val="single" w:sz="4" w:space="0" w:color="auto"/>
+      </w:tblBorders>
+    </w:tblPr>
+    <w:tblStylePr w:type="firstRow">
+      <w:pPr>
+        <w:wordWrap/>
+        <w:spacing w:line="240" w:lineRule="auto"/>
+        <w:jc w:val="left"/>
+      </w:pPr>
+      <w:tblPr/>
+      <w:tcPr>
+        <w:tcBorders>
+          <w:bottom w:val="single" w:sz="4" w:space="0" w:color="auto"/>
+        </w:tcBorders>
+      </w:tcPr>
+    </w:tblStylePr>
+  </w:style>
 </w:styles>
 </file>
 

</xml_diff>